<commit_message>
docs(v5): diagnostic Word, grilles v5, outil Excel/VBA 5.0, guide et formation mis à jour
- Diagnostic du modèle v5 (régionalité, tranche financée, programme mixte,
  équipements exigés, déblocages vs calendrier, autres améliorations, poids
  v4/v5, impact simulé sur les 10 projets de promotion, mise en œuvre).
- Grilles de scoring v5 générées depuis l'instantané (nouveautés repérées).
- Outil Excel 5.0 : modèle v5, calculateurs F à H (déblocages, plan de tirage,
  équipements, programme mixte, désistements, coût à terminaison), 26 cas ;
  vérifié sous LibreOffice (formules 26/26, calculateurs 10/10, macros).
- Guide du chargé d'affaires et support de formation : pièces P34 à P39,
  12 nouvelles données, suivi des tranches, équipements et déblocages.

Co-Authored-By: Claude Opus 5.5 <noreply@anthropic.com>
Claude-Session: https://claude.ai/code/session_01Li2W9WshQNGLFvtEf7D8Zo
</commit_message>
<xml_diff>
--- a/docs/Guide_Charge_Affaires_Promotion_Immobiliere.docx
+++ b/docs/Guide_Charge_Affaires_Promotion_Immobiliere.docx
@@ -84,7 +84,7 @@
           <w:sz w:val="22"/>
           <w:szCs w:val="22"/>
         </w:rPr>
-        <w:t xml:space="preserve">Modèle de scoring PI_PROMOTION v4.0.0 · outil Excel 4.1</w:t>
+        <w:t xml:space="preserve">Modèle de scoring PI_PROMOTION v5.0.0 · outil Excel 4.1</w:t>
       </w:r>
     </w:p>
     <w:p>
@@ -99,7 +99,7 @@
           <w:sz w:val="20"/>
           <w:szCs w:val="20"/>
         </w:rPr>
-        <w:t xml:space="preserve">30 septembre 2026</w:t>
+        <w:t xml:space="preserve">1er octobre 2026</w:t>
       </w:r>
     </w:p>
     <w:p>
@@ -163,7 +163,7 @@
           <w:sz w:val="21"/>
           <w:szCs w:val="21"/>
         </w:rPr>
-        <w:t xml:space="preserve">Votre dossier est noté par le modèle PI_PROMOTION : 29 critères répartis en 4 domaines, 13 alertes, puis une décision. La qualité de cette note dépend entièrement des pièces que vous réunissez et de la rigueur de la saisie.</w:t>
+        <w:t xml:space="preserve">Votre dossier est noté par le modèle PI_PROMOTION v5.0.0 : 37 critères répartis en 4 domaines, 18 alertes, puis une décision. La qualité de cette note dépend entièrement des pièces que vous réunissez et de la rigueur de la saisie.</w:t>
       </w:r>
     </w:p>
     <w:tbl>
@@ -431,7 +431,7 @@
                 <w:sz w:val="17"/>
                 <w:szCs w:val="17"/>
               </w:rPr>
-              <w:t xml:space="preserve">Foncier &amp; autorisations · Marché &amp; positionnement · Complexité technique · Avancement vs planning · Litiges clients / SAV · Sensibilité macro / subvention · Coût foncier / CA · Chaîne d'autorisations — complétude</w:t>
+              <w:t xml:space="preserve">Foncier &amp; autorisations · Marché &amp; positionnement · Complexité technique · Avancement vs planning · Litiges clients / SAV · Sensibilité macro / subvention · Coût foncier / CA · Chaîne d'autorisations — complétude · Tension du marché régional · Entreprise de travaux et garanties de marché · Équipements exigés non budgétés (% du coût) · Autonomie du périmètre financé (tranche)</w:t>
             </w:r>
           </w:p>
         </w:tc>
@@ -511,7 +511,7 @@
                 <w:sz w:val="17"/>
                 <w:szCs w:val="17"/>
               </w:rPr>
-              <w:t xml:space="preserve">Préventes sécurisées · Ventes vs planning · DSO · Cash coverage · Impasse brute · Rotation stock · Marge stressée -10% · Ventes sécurisées par le financement acquéreur</w:t>
+              <w:t xml:space="preserve">Préventes sécurisées · Ventes vs planning · DSO · Cash coverage · Impasse brute · Rotation stock · Marge stressée -10% · Ventes sécurisées par le financement acquéreur · Part du CA en commerces, bureaux, hôtel · Taux de désistement des réservations</w:t>
             </w:r>
           </w:p>
         </w:tc>
@@ -594,7 +594,7 @@
                 <w:sz w:val="17"/>
                 <w:szCs w:val="17"/>
               </w:rPr>
-              <w:t xml:space="preserve">Marge brute · LTC · LTV stressée · Couverture garanties · Rang bancaire 1er rang · Interest coverage · Quotité de désengagement − équilibre</w:t>
+              <w:t xml:space="preserve">Marge brute · LTC · LTV stressée · Couverture garanties · Rang bancaire 1er rang · Interest coverage · Quotité de désengagement − équilibre · Déblocages vs avancement certifié · Dépassement du coût à terminaison</w:t>
             </w:r>
           </w:p>
         </w:tc>
@@ -6075,6 +6075,651 @@
           </w:p>
         </w:tc>
       </w:tr>
+      <w:tr>
+        <w:trPr>
+          <w:cantSplit/>
+        </w:trPr>
+        <w:tc>
+          <w:tcPr>
+            <w:tcW w:type="dxa" w:w="700"/>
+            <w:tcMar>
+              <w:top w:type="dxa" w:w="40"/>
+              <w:left w:type="dxa" w:w="80"/>
+              <w:bottom w:type="dxa" w:w="40"/>
+              <w:right w:type="dxa" w:w="80"/>
+            </w:tcMar>
+          </w:tcPr>
+          <w:p>
+            <w:pPr>
+              <w:spacing w:after="0" w:line="240"/>
+            </w:pPr>
+            <w:r>
+              <w:rPr>
+                <w:rFonts w:ascii="Calibri" w:cs="Calibri" w:eastAsia="Calibri" w:hAnsi="Calibri"/>
+                <w:b/>
+                <w:bCs/>
+                <w:sz w:val="17"/>
+                <w:szCs w:val="17"/>
+              </w:rPr>
+              <w:t xml:space="preserve">P34</w:t>
+            </w:r>
+          </w:p>
+        </w:tc>
+        <w:tc>
+          <w:tcPr>
+            <w:tcW w:type="dxa" w:w="5500"/>
+            <w:tcMar>
+              <w:top w:type="dxa" w:w="40"/>
+              <w:left w:type="dxa" w:w="80"/>
+              <w:bottom w:type="dxa" w:w="40"/>
+              <w:right w:type="dxa" w:w="80"/>
+            </w:tcMar>
+          </w:tcPr>
+          <w:p>
+            <w:pPr>
+              <w:spacing w:after="0" w:line="240"/>
+            </w:pPr>
+            <w:r>
+              <w:rPr>
+                <w:rFonts w:ascii="Calibri" w:cs="Calibri" w:eastAsia="Calibri" w:hAnsi="Calibri"/>
+                <w:sz w:val="17"/>
+                <w:szCs w:val="17"/>
+              </w:rPr>
+              <w:t xml:space="preserve">Plan de masse et découpage en tranches : tranches financées par la banque, ouvrages communs (accès, VRD, raccordements) et leur financement</w:t>
+            </w:r>
+          </w:p>
+        </w:tc>
+        <w:tc>
+          <w:tcPr>
+            <w:tcW w:type="dxa" w:w="2600"/>
+            <w:tcMar>
+              <w:top w:type="dxa" w:w="40"/>
+              <w:left w:type="dxa" w:w="80"/>
+              <w:bottom w:type="dxa" w:w="40"/>
+              <w:right w:type="dxa" w:w="80"/>
+            </w:tcMar>
+          </w:tcPr>
+          <w:p>
+            <w:pPr>
+              <w:spacing w:after="0" w:line="240"/>
+            </w:pPr>
+            <w:r>
+              <w:rPr>
+                <w:rFonts w:ascii="Calibri" w:cs="Calibri" w:eastAsia="Calibri" w:hAnsi="Calibri"/>
+                <w:sz w:val="17"/>
+                <w:szCs w:val="17"/>
+              </w:rPr>
+              <w:t xml:space="preserve">Promoteur ; architecte</w:t>
+            </w:r>
+          </w:p>
+        </w:tc>
+        <w:tc>
+          <w:tcPr>
+            <w:tcW w:type="dxa" w:w="2300"/>
+            <w:tcMar>
+              <w:top w:type="dxa" w:w="40"/>
+              <w:left w:type="dxa" w:w="80"/>
+              <w:bottom w:type="dxa" w:w="40"/>
+              <w:right w:type="dxa" w:w="80"/>
+            </w:tcMar>
+          </w:tcPr>
+          <w:p>
+            <w:pPr>
+              <w:spacing w:after="0" w:line="240"/>
+            </w:pPr>
+            <w:r>
+              <w:rPr>
+                <w:rFonts w:ascii="Calibri" w:cs="Calibri" w:eastAsia="Calibri" w:hAnsi="Calibri"/>
+                <w:sz w:val="17"/>
+                <w:szCs w:val="17"/>
+              </w:rPr>
+              <w:t xml:space="preserve">Version autorisée</w:t>
+            </w:r>
+          </w:p>
+        </w:tc>
+        <w:tc>
+          <w:tcPr>
+            <w:tcW w:type="dxa" w:w="3300"/>
+            <w:tcMar>
+              <w:top w:type="dxa" w:w="40"/>
+              <w:left w:type="dxa" w:w="80"/>
+              <w:bottom w:type="dxa" w:w="40"/>
+              <w:right w:type="dxa" w:w="80"/>
+            </w:tcMar>
+          </w:tcPr>
+          <w:p>
+            <w:pPr>
+              <w:spacing w:after="0" w:line="240"/>
+            </w:pPr>
+            <w:r>
+              <w:rPr>
+                <w:rFonts w:ascii="Calibri" w:cs="Calibri" w:eastAsia="Calibri" w:hAnsi="Calibri"/>
+                <w:sz w:val="17"/>
+                <w:szCs w:val="17"/>
+              </w:rPr>
+              <w:t xml:space="preserve">Périmètre financé ; autonomie de la tranche</w:t>
+            </w:r>
+          </w:p>
+        </w:tc>
+      </w:tr>
+      <w:tr>
+        <w:trPr>
+          <w:cantSplit/>
+        </w:trPr>
+        <w:tc>
+          <w:tcPr>
+            <w:tcW w:type="dxa" w:w="700"/>
+            <w:shd w:fill="F2F5FB" w:color="auto" w:val="clear"/>
+            <w:tcMar>
+              <w:top w:type="dxa" w:w="40"/>
+              <w:left w:type="dxa" w:w="80"/>
+              <w:bottom w:type="dxa" w:w="40"/>
+              <w:right w:type="dxa" w:w="80"/>
+            </w:tcMar>
+          </w:tcPr>
+          <w:p>
+            <w:pPr>
+              <w:spacing w:after="0" w:line="240"/>
+            </w:pPr>
+            <w:r>
+              <w:rPr>
+                <w:rFonts w:ascii="Calibri" w:cs="Calibri" w:eastAsia="Calibri" w:hAnsi="Calibri"/>
+                <w:b/>
+                <w:bCs/>
+                <w:sz w:val="17"/>
+                <w:szCs w:val="17"/>
+              </w:rPr>
+              <w:t xml:space="preserve">P35</w:t>
+            </w:r>
+          </w:p>
+        </w:tc>
+        <w:tc>
+          <w:tcPr>
+            <w:tcW w:type="dxa" w:w="5500"/>
+            <w:shd w:fill="F2F5FB" w:color="auto" w:val="clear"/>
+            <w:tcMar>
+              <w:top w:type="dxa" w:w="40"/>
+              <w:left w:type="dxa" w:w="80"/>
+              <w:bottom w:type="dxa" w:w="40"/>
+              <w:right w:type="dxa" w:w="80"/>
+            </w:tcMar>
+          </w:tcPr>
+          <w:p>
+            <w:pPr>
+              <w:spacing w:after="0" w:line="240"/>
+            </w:pPr>
+            <w:r>
+              <w:rPr>
+                <w:rFonts w:ascii="Calibri" w:cs="Calibri" w:eastAsia="Calibri" w:hAnsi="Calibri"/>
+                <w:sz w:val="17"/>
+                <w:szCs w:val="17"/>
+              </w:rPr>
+              <w:t xml:space="preserve">Cahier des charges du lotissement, convention avec la commune ou prescriptions de l'autorisation fixant les équipements exigés (mosquée, école, voirie…), avec coût, calendrier et financeur</w:t>
+            </w:r>
+          </w:p>
+        </w:tc>
+        <w:tc>
+          <w:tcPr>
+            <w:tcW w:type="dxa" w:w="2600"/>
+            <w:shd w:fill="F2F5FB" w:color="auto" w:val="clear"/>
+            <w:tcMar>
+              <w:top w:type="dxa" w:w="40"/>
+              <w:left w:type="dxa" w:w="80"/>
+              <w:bottom w:type="dxa" w:w="40"/>
+              <w:right w:type="dxa" w:w="80"/>
+            </w:tcMar>
+          </w:tcPr>
+          <w:p>
+            <w:pPr>
+              <w:spacing w:after="0" w:line="240"/>
+            </w:pPr>
+            <w:r>
+              <w:rPr>
+                <w:rFonts w:ascii="Calibri" w:cs="Calibri" w:eastAsia="Calibri" w:hAnsi="Calibri"/>
+                <w:sz w:val="17"/>
+                <w:szCs w:val="17"/>
+              </w:rPr>
+              <w:t xml:space="preserve">Commune ; agence urbaine ; promoteur</w:t>
+            </w:r>
+          </w:p>
+        </w:tc>
+        <w:tc>
+          <w:tcPr>
+            <w:tcW w:type="dxa" w:w="2300"/>
+            <w:shd w:fill="F2F5FB" w:color="auto" w:val="clear"/>
+            <w:tcMar>
+              <w:top w:type="dxa" w:w="40"/>
+              <w:left w:type="dxa" w:w="80"/>
+              <w:bottom w:type="dxa" w:w="40"/>
+              <w:right w:type="dxa" w:w="80"/>
+            </w:tcMar>
+          </w:tcPr>
+          <w:p>
+            <w:pPr>
+              <w:spacing w:after="0" w:line="240"/>
+            </w:pPr>
+            <w:r>
+              <w:rPr>
+                <w:rFonts w:ascii="Calibri" w:cs="Calibri" w:eastAsia="Calibri" w:hAnsi="Calibri"/>
+                <w:sz w:val="17"/>
+                <w:szCs w:val="17"/>
+              </w:rPr>
+              <w:t xml:space="preserve">Version signée</w:t>
+            </w:r>
+          </w:p>
+        </w:tc>
+        <w:tc>
+          <w:tcPr>
+            <w:tcW w:type="dxa" w:w="3300"/>
+            <w:shd w:fill="F2F5FB" w:color="auto" w:val="clear"/>
+            <w:tcMar>
+              <w:top w:type="dxa" w:w="40"/>
+              <w:left w:type="dxa" w:w="80"/>
+              <w:bottom w:type="dxa" w:w="40"/>
+              <w:right w:type="dxa" w:w="80"/>
+            </w:tcMar>
+          </w:tcPr>
+          <w:p>
+            <w:pPr>
+              <w:spacing w:after="0" w:line="240"/>
+            </w:pPr>
+            <w:r>
+              <w:rPr>
+                <w:rFonts w:ascii="Calibri" w:cs="Calibri" w:eastAsia="Calibri" w:hAnsi="Calibri"/>
+                <w:sz w:val="17"/>
+                <w:szCs w:val="17"/>
+              </w:rPr>
+              <w:t xml:space="preserve">Équipements exigés non budgétés ; équipement conditionnant la réception</w:t>
+            </w:r>
+          </w:p>
+        </w:tc>
+      </w:tr>
+      <w:tr>
+        <w:trPr>
+          <w:cantSplit/>
+        </w:trPr>
+        <w:tc>
+          <w:tcPr>
+            <w:tcW w:type="dxa" w:w="700"/>
+            <w:tcMar>
+              <w:top w:type="dxa" w:w="40"/>
+              <w:left w:type="dxa" w:w="80"/>
+              <w:bottom w:type="dxa" w:w="40"/>
+              <w:right w:type="dxa" w:w="80"/>
+            </w:tcMar>
+          </w:tcPr>
+          <w:p>
+            <w:pPr>
+              <w:spacing w:after="0" w:line="240"/>
+            </w:pPr>
+            <w:r>
+              <w:rPr>
+                <w:rFonts w:ascii="Calibri" w:cs="Calibri" w:eastAsia="Calibri" w:hAnsi="Calibri"/>
+                <w:b/>
+                <w:bCs/>
+                <w:sz w:val="17"/>
+                <w:szCs w:val="17"/>
+              </w:rPr>
+              <w:t xml:space="preserve">P36</w:t>
+            </w:r>
+          </w:p>
+        </w:tc>
+        <w:tc>
+          <w:tcPr>
+            <w:tcW w:type="dxa" w:w="5500"/>
+            <w:tcMar>
+              <w:top w:type="dxa" w:w="40"/>
+              <w:left w:type="dxa" w:w="80"/>
+              <w:bottom w:type="dxa" w:w="40"/>
+              <w:right w:type="dxa" w:w="80"/>
+            </w:tcMar>
+          </w:tcPr>
+          <w:p>
+            <w:pPr>
+              <w:spacing w:after="0" w:line="240"/>
+            </w:pPr>
+            <w:r>
+              <w:rPr>
+                <w:rFonts w:ascii="Calibri" w:cs="Calibri" w:eastAsia="Calibri" w:hAnsi="Calibri"/>
+                <w:sz w:val="17"/>
+                <w:szCs w:val="17"/>
+              </w:rPr>
+              <w:t xml:space="preserve">Marché de travaux de l'entreprise générale : classification / qualification, nature (forfait, régie), caution de bonne exécution, retenue de garantie</w:t>
+            </w:r>
+          </w:p>
+        </w:tc>
+        <w:tc>
+          <w:tcPr>
+            <w:tcW w:type="dxa" w:w="2600"/>
+            <w:tcMar>
+              <w:top w:type="dxa" w:w="40"/>
+              <w:left w:type="dxa" w:w="80"/>
+              <w:bottom w:type="dxa" w:w="40"/>
+              <w:right w:type="dxa" w:w="80"/>
+            </w:tcMar>
+          </w:tcPr>
+          <w:p>
+            <w:pPr>
+              <w:spacing w:after="0" w:line="240"/>
+            </w:pPr>
+            <w:r>
+              <w:rPr>
+                <w:rFonts w:ascii="Calibri" w:cs="Calibri" w:eastAsia="Calibri" w:hAnsi="Calibri"/>
+                <w:sz w:val="17"/>
+                <w:szCs w:val="17"/>
+              </w:rPr>
+              <w:t xml:space="preserve">Promoteur ; entreprise</w:t>
+            </w:r>
+          </w:p>
+        </w:tc>
+        <w:tc>
+          <w:tcPr>
+            <w:tcW w:type="dxa" w:w="2300"/>
+            <w:tcMar>
+              <w:top w:type="dxa" w:w="40"/>
+              <w:left w:type="dxa" w:w="80"/>
+              <w:bottom w:type="dxa" w:w="40"/>
+              <w:right w:type="dxa" w:w="80"/>
+            </w:tcMar>
+          </w:tcPr>
+          <w:p>
+            <w:pPr>
+              <w:spacing w:after="0" w:line="240"/>
+            </w:pPr>
+            <w:r>
+              <w:rPr>
+                <w:rFonts w:ascii="Calibri" w:cs="Calibri" w:eastAsia="Calibri" w:hAnsi="Calibri"/>
+                <w:sz w:val="17"/>
+                <w:szCs w:val="17"/>
+              </w:rPr>
+              <w:t xml:space="preserve">Version signée</w:t>
+            </w:r>
+          </w:p>
+        </w:tc>
+        <w:tc>
+          <w:tcPr>
+            <w:tcW w:type="dxa" w:w="3300"/>
+            <w:tcMar>
+              <w:top w:type="dxa" w:w="40"/>
+              <w:left w:type="dxa" w:w="80"/>
+              <w:bottom w:type="dxa" w:w="40"/>
+              <w:right w:type="dxa" w:w="80"/>
+            </w:tcMar>
+          </w:tcPr>
+          <w:p>
+            <w:pPr>
+              <w:spacing w:after="0" w:line="240"/>
+            </w:pPr>
+            <w:r>
+              <w:rPr>
+                <w:rFonts w:ascii="Calibri" w:cs="Calibri" w:eastAsia="Calibri" w:hAnsi="Calibri"/>
+                <w:sz w:val="17"/>
+                <w:szCs w:val="17"/>
+              </w:rPr>
+              <w:t xml:space="preserve">Entreprise de travaux et garanties de marché</w:t>
+            </w:r>
+          </w:p>
+        </w:tc>
+      </w:tr>
+      <w:tr>
+        <w:trPr>
+          <w:cantSplit/>
+        </w:trPr>
+        <w:tc>
+          <w:tcPr>
+            <w:tcW w:type="dxa" w:w="700"/>
+            <w:shd w:fill="F2F5FB" w:color="auto" w:val="clear"/>
+            <w:tcMar>
+              <w:top w:type="dxa" w:w="40"/>
+              <w:left w:type="dxa" w:w="80"/>
+              <w:bottom w:type="dxa" w:w="40"/>
+              <w:right w:type="dxa" w:w="80"/>
+            </w:tcMar>
+          </w:tcPr>
+          <w:p>
+            <w:pPr>
+              <w:spacing w:after="0" w:line="240"/>
+            </w:pPr>
+            <w:r>
+              <w:rPr>
+                <w:rFonts w:ascii="Calibri" w:cs="Calibri" w:eastAsia="Calibri" w:hAnsi="Calibri"/>
+                <w:b/>
+                <w:bCs/>
+                <w:sz w:val="17"/>
+                <w:szCs w:val="17"/>
+              </w:rPr>
+              <w:t xml:space="preserve">P37</w:t>
+            </w:r>
+          </w:p>
+        </w:tc>
+        <w:tc>
+          <w:tcPr>
+            <w:tcW w:type="dxa" w:w="5500"/>
+            <w:shd w:fill="F2F5FB" w:color="auto" w:val="clear"/>
+            <w:tcMar>
+              <w:top w:type="dxa" w:w="40"/>
+              <w:left w:type="dxa" w:w="80"/>
+              <w:bottom w:type="dxa" w:w="40"/>
+              <w:right w:type="dxa" w:w="80"/>
+            </w:tcMar>
+          </w:tcPr>
+          <w:p>
+            <w:pPr>
+              <w:spacing w:after="0" w:line="240"/>
+            </w:pPr>
+            <w:r>
+              <w:rPr>
+                <w:rFonts w:ascii="Calibri" w:cs="Calibri" w:eastAsia="Calibri" w:hAnsi="Calibri"/>
+                <w:sz w:val="17"/>
+                <w:szCs w:val="17"/>
+              </w:rPr>
+              <w:t xml:space="preserve">Coût à terminaison actualisé (budget initial, engagé, reste à engager, écarts)</w:t>
+            </w:r>
+          </w:p>
+        </w:tc>
+        <w:tc>
+          <w:tcPr>
+            <w:tcW w:type="dxa" w:w="2600"/>
+            <w:shd w:fill="F2F5FB" w:color="auto" w:val="clear"/>
+            <w:tcMar>
+              <w:top w:type="dxa" w:w="40"/>
+              <w:left w:type="dxa" w:w="80"/>
+              <w:bottom w:type="dxa" w:w="40"/>
+              <w:right w:type="dxa" w:w="80"/>
+            </w:tcMar>
+          </w:tcPr>
+          <w:p>
+            <w:pPr>
+              <w:spacing w:after="0" w:line="240"/>
+            </w:pPr>
+            <w:r>
+              <w:rPr>
+                <w:rFonts w:ascii="Calibri" w:cs="Calibri" w:eastAsia="Calibri" w:hAnsi="Calibri"/>
+                <w:sz w:val="17"/>
+                <w:szCs w:val="17"/>
+              </w:rPr>
+              <w:t xml:space="preserve">Promoteur ; maître d'œuvre</w:t>
+            </w:r>
+          </w:p>
+        </w:tc>
+        <w:tc>
+          <w:tcPr>
+            <w:tcW w:type="dxa" w:w="2300"/>
+            <w:shd w:fill="F2F5FB" w:color="auto" w:val="clear"/>
+            <w:tcMar>
+              <w:top w:type="dxa" w:w="40"/>
+              <w:left w:type="dxa" w:w="80"/>
+              <w:bottom w:type="dxa" w:w="40"/>
+              <w:right w:type="dxa" w:w="80"/>
+            </w:tcMar>
+          </w:tcPr>
+          <w:p>
+            <w:pPr>
+              <w:spacing w:after="0" w:line="240"/>
+            </w:pPr>
+            <w:r>
+              <w:rPr>
+                <w:rFonts w:ascii="Calibri" w:cs="Calibri" w:eastAsia="Calibri" w:hAnsi="Calibri"/>
+                <w:sz w:val="17"/>
+                <w:szCs w:val="17"/>
+              </w:rPr>
+              <w:t xml:space="preserve">À chaque revue</w:t>
+            </w:r>
+          </w:p>
+        </w:tc>
+        <w:tc>
+          <w:tcPr>
+            <w:tcW w:type="dxa" w:w="3300"/>
+            <w:shd w:fill="F2F5FB" w:color="auto" w:val="clear"/>
+            <w:tcMar>
+              <w:top w:type="dxa" w:w="40"/>
+              <w:left w:type="dxa" w:w="80"/>
+              <w:bottom w:type="dxa" w:w="40"/>
+              <w:right w:type="dxa" w:w="80"/>
+            </w:tcMar>
+          </w:tcPr>
+          <w:p>
+            <w:pPr>
+              <w:spacing w:after="0" w:line="240"/>
+            </w:pPr>
+            <w:r>
+              <w:rPr>
+                <w:rFonts w:ascii="Calibri" w:cs="Calibri" w:eastAsia="Calibri" w:hAnsi="Calibri"/>
+                <w:sz w:val="17"/>
+                <w:szCs w:val="17"/>
+              </w:rPr>
+              <w:t xml:space="preserve">Dépassement du coût à terminaison</w:t>
+            </w:r>
+          </w:p>
+        </w:tc>
+      </w:tr>
+      <w:tr>
+        <w:trPr>
+          <w:cantSplit/>
+        </w:trPr>
+        <w:tc>
+          <w:tcPr>
+            <w:tcW w:type="dxa" w:w="700"/>
+            <w:tcMar>
+              <w:top w:type="dxa" w:w="40"/>
+              <w:left w:type="dxa" w:w="80"/>
+              <w:bottom w:type="dxa" w:w="40"/>
+              <w:right w:type="dxa" w:w="80"/>
+            </w:tcMar>
+          </w:tcPr>
+          <w:p>
+            <w:pPr>
+              <w:spacing w:after="0" w:line="240"/>
+            </w:pPr>
+            <w:r>
+              <w:rPr>
+                <w:rFonts w:ascii="Calibri" w:cs="Calibri" w:eastAsia="Calibri" w:hAnsi="Calibri"/>
+                <w:b/>
+                <w:bCs/>
+                <w:sz w:val="17"/>
+                <w:szCs w:val="17"/>
+              </w:rPr>
+              <w:t xml:space="preserve">P39</w:t>
+            </w:r>
+          </w:p>
+        </w:tc>
+        <w:tc>
+          <w:tcPr>
+            <w:tcW w:type="dxa" w:w="5500"/>
+            <w:tcMar>
+              <w:top w:type="dxa" w:w="40"/>
+              <w:left w:type="dxa" w:w="80"/>
+              <w:bottom w:type="dxa" w:w="40"/>
+              <w:right w:type="dxa" w:w="80"/>
+            </w:tcMar>
+          </w:tcPr>
+          <w:p>
+            <w:pPr>
+              <w:spacing w:after="0" w:line="240"/>
+            </w:pPr>
+            <w:r>
+              <w:rPr>
+                <w:rFonts w:ascii="Calibri" w:cs="Calibri" w:eastAsia="Calibri" w:hAnsi="Calibri"/>
+                <w:sz w:val="17"/>
+                <w:szCs w:val="17"/>
+              </w:rPr>
+              <w:t xml:space="preserve">Note de conjoncture du marché régional (référentiel « Marché régional » de la Direction des risques) ou étude de marché régionale</w:t>
+            </w:r>
+          </w:p>
+        </w:tc>
+        <w:tc>
+          <w:tcPr>
+            <w:tcW w:type="dxa" w:w="2600"/>
+            <w:tcMar>
+              <w:top w:type="dxa" w:w="40"/>
+              <w:left w:type="dxa" w:w="80"/>
+              <w:bottom w:type="dxa" w:w="40"/>
+              <w:right w:type="dxa" w:w="80"/>
+            </w:tcMar>
+          </w:tcPr>
+          <w:p>
+            <w:pPr>
+              <w:spacing w:after="0" w:line="240"/>
+            </w:pPr>
+            <w:r>
+              <w:rPr>
+                <w:rFonts w:ascii="Calibri" w:cs="Calibri" w:eastAsia="Calibri" w:hAnsi="Calibri"/>
+                <w:sz w:val="17"/>
+                <w:szCs w:val="17"/>
+              </w:rPr>
+              <w:t xml:space="preserve">Direction des risques ; expert</w:t>
+            </w:r>
+          </w:p>
+        </w:tc>
+        <w:tc>
+          <w:tcPr>
+            <w:tcW w:type="dxa" w:w="2300"/>
+            <w:tcMar>
+              <w:top w:type="dxa" w:w="40"/>
+              <w:left w:type="dxa" w:w="80"/>
+              <w:bottom w:type="dxa" w:w="40"/>
+              <w:right w:type="dxa" w:w="80"/>
+            </w:tcMar>
+          </w:tcPr>
+          <w:p>
+            <w:pPr>
+              <w:spacing w:after="0" w:line="240"/>
+            </w:pPr>
+            <w:r>
+              <w:rPr>
+                <w:rFonts w:ascii="Calibri" w:cs="Calibri" w:eastAsia="Calibri" w:hAnsi="Calibri"/>
+                <w:sz w:val="17"/>
+                <w:szCs w:val="17"/>
+              </w:rPr>
+              <w:t xml:space="preserve">Moins de 12 mois</w:t>
+            </w:r>
+          </w:p>
+        </w:tc>
+        <w:tc>
+          <w:tcPr>
+            <w:tcW w:type="dxa" w:w="3300"/>
+            <w:tcMar>
+              <w:top w:type="dxa" w:w="40"/>
+              <w:left w:type="dxa" w:w="80"/>
+              <w:bottom w:type="dxa" w:w="40"/>
+              <w:right w:type="dxa" w:w="80"/>
+            </w:tcMar>
+          </w:tcPr>
+          <w:p>
+            <w:pPr>
+              <w:spacing w:after="0" w:line="240"/>
+            </w:pPr>
+            <w:r>
+              <w:rPr>
+                <w:rFonts w:ascii="Calibri" w:cs="Calibri" w:eastAsia="Calibri" w:hAnsi="Calibri"/>
+                <w:sz w:val="17"/>
+                <w:szCs w:val="17"/>
+              </w:rPr>
+              <w:t xml:space="preserve">Tension du marché régional</w:t>
+            </w:r>
+          </w:p>
+        </w:tc>
+      </w:tr>
     </w:tbl>
     <w:p>
       <w:pPr>
@@ -6764,6 +7409,133 @@
                 <w:szCs w:val="17"/>
               </w:rPr>
               <w:t xml:space="preserve">Litiges clients / SAV ; exposition contentieuse</w:t>
+            </w:r>
+          </w:p>
+        </w:tc>
+      </w:tr>
+      <w:tr>
+        <w:trPr>
+          <w:cantSplit/>
+        </w:trPr>
+        <w:tc>
+          <w:tcPr>
+            <w:tcW w:type="dxa" w:w="700"/>
+            <w:tcMar>
+              <w:top w:type="dxa" w:w="40"/>
+              <w:left w:type="dxa" w:w="80"/>
+              <w:bottom w:type="dxa" w:w="40"/>
+              <w:right w:type="dxa" w:w="80"/>
+            </w:tcMar>
+          </w:tcPr>
+          <w:p>
+            <w:pPr>
+              <w:spacing w:after="0" w:line="240"/>
+            </w:pPr>
+            <w:r>
+              <w:rPr>
+                <w:rFonts w:ascii="Calibri" w:cs="Calibri" w:eastAsia="Calibri" w:hAnsi="Calibri"/>
+                <w:b/>
+                <w:bCs/>
+                <w:sz w:val="17"/>
+                <w:szCs w:val="17"/>
+              </w:rPr>
+              <w:t xml:space="preserve">P38</w:t>
+            </w:r>
+          </w:p>
+        </w:tc>
+        <w:tc>
+          <w:tcPr>
+            <w:tcW w:type="dxa" w:w="5500"/>
+            <w:tcMar>
+              <w:top w:type="dxa" w:w="40"/>
+              <w:left w:type="dxa" w:w="80"/>
+              <w:bottom w:type="dxa" w:w="40"/>
+              <w:right w:type="dxa" w:w="80"/>
+            </w:tcMar>
+          </w:tcPr>
+          <w:p>
+            <w:pPr>
+              <w:spacing w:after="0" w:line="240"/>
+            </w:pPr>
+            <w:r>
+              <w:rPr>
+                <w:rFonts w:ascii="Calibri" w:cs="Calibri" w:eastAsia="Calibri" w:hAnsi="Calibri"/>
+                <w:sz w:val="17"/>
+                <w:szCs w:val="17"/>
+              </w:rPr>
+              <w:t xml:space="preserve">Lettre d'engagement d'un opérateur hôtelier, d'un investisseur ou de preneurs pour les composantes non résidentielles (hôtel, commerces, bureaux)</w:t>
+            </w:r>
+          </w:p>
+        </w:tc>
+        <w:tc>
+          <w:tcPr>
+            <w:tcW w:type="dxa" w:w="2600"/>
+            <w:tcMar>
+              <w:top w:type="dxa" w:w="40"/>
+              <w:left w:type="dxa" w:w="80"/>
+              <w:bottom w:type="dxa" w:w="40"/>
+              <w:right w:type="dxa" w:w="80"/>
+            </w:tcMar>
+          </w:tcPr>
+          <w:p>
+            <w:pPr>
+              <w:spacing w:after="0" w:line="240"/>
+            </w:pPr>
+            <w:r>
+              <w:rPr>
+                <w:rFonts w:ascii="Calibri" w:cs="Calibri" w:eastAsia="Calibri" w:hAnsi="Calibri"/>
+                <w:sz w:val="17"/>
+                <w:szCs w:val="17"/>
+              </w:rPr>
+              <w:t xml:space="preserve">Opérateur ; investisseur ; preneur</w:t>
+            </w:r>
+          </w:p>
+        </w:tc>
+        <w:tc>
+          <w:tcPr>
+            <w:tcW w:type="dxa" w:w="2300"/>
+            <w:tcMar>
+              <w:top w:type="dxa" w:w="40"/>
+              <w:left w:type="dxa" w:w="80"/>
+              <w:bottom w:type="dxa" w:w="40"/>
+              <w:right w:type="dxa" w:w="80"/>
+            </w:tcMar>
+          </w:tcPr>
+          <w:p>
+            <w:pPr>
+              <w:spacing w:after="0" w:line="240"/>
+            </w:pPr>
+            <w:r>
+              <w:rPr>
+                <w:rFonts w:ascii="Calibri" w:cs="Calibri" w:eastAsia="Calibri" w:hAnsi="Calibri"/>
+                <w:sz w:val="17"/>
+                <w:szCs w:val="17"/>
+              </w:rPr>
+              <w:t xml:space="preserve">En vigueur</w:t>
+            </w:r>
+          </w:p>
+        </w:tc>
+        <w:tc>
+          <w:tcPr>
+            <w:tcW w:type="dxa" w:w="3300"/>
+            <w:tcMar>
+              <w:top w:type="dxa" w:w="40"/>
+              <w:left w:type="dxa" w:w="80"/>
+              <w:bottom w:type="dxa" w:w="40"/>
+              <w:right w:type="dxa" w:w="80"/>
+            </w:tcMar>
+          </w:tcPr>
+          <w:p>
+            <w:pPr>
+              <w:spacing w:after="0" w:line="240"/>
+            </w:pPr>
+            <w:r>
+              <w:rPr>
+                <w:rFonts w:ascii="Calibri" w:cs="Calibri" w:eastAsia="Calibri" w:hAnsi="Calibri"/>
+                <w:sz w:val="17"/>
+                <w:szCs w:val="17"/>
+              </w:rPr>
+              <w:t xml:space="preserve">Composante sans preneur ; part du CA à écoulement lent</w:t>
             </w:r>
           </w:p>
         </w:tc>
@@ -10614,6 +11386,612 @@
           </w:p>
         </w:tc>
       </w:tr>
+      <w:tr>
+        <w:trPr>
+          <w:cantSplit/>
+        </w:trPr>
+        <w:tc>
+          <w:tcPr>
+            <w:tcW w:type="dxa" w:w="2600"/>
+            <w:tcMar>
+              <w:top w:type="dxa" w:w="40"/>
+              <w:left w:type="dxa" w:w="80"/>
+              <w:bottom w:type="dxa" w:w="40"/>
+              <w:right w:type="dxa" w:w="80"/>
+            </w:tcMar>
+          </w:tcPr>
+          <w:p>
+            <w:pPr>
+              <w:spacing w:after="0" w:line="240"/>
+            </w:pPr>
+            <w:r>
+              <w:rPr>
+                <w:rFonts w:ascii="Calibri" w:cs="Calibri" w:eastAsia="Calibri" w:hAnsi="Calibri"/>
+                <w:b/>
+                <w:bCs/>
+                <w:sz w:val="17"/>
+                <w:szCs w:val="17"/>
+              </w:rPr>
+              <w:t xml:space="preserve">Tension du marché régional</w:t>
+            </w:r>
+            <w:r>
+              <w:rPr>
+                <w:rFonts w:ascii="Calibri" w:cs="Calibri" w:eastAsia="Calibri" w:hAnsi="Calibri"/>
+                <w:color w:val="595959"/>
+                <w:sz w:val="14"/>
+                <w:szCs w:val="14"/>
+              </w:rPr>
+              <w:t xml:space="preserve">  D2C9 · regional_market_tension</w:t>
+            </w:r>
+            <w:r>
+              <w:rPr>
+                <w:rFonts w:ascii="Calibri" w:cs="Calibri" w:eastAsia="Calibri" w:hAnsi="Calibri"/>
+                <w:i/>
+                <w:iCs/>
+                <w:color w:val="595959"/>
+                <w:sz w:val="14"/>
+                <w:szCs w:val="14"/>
+              </w:rPr>
+              <w:br/>
+              <w:t xml:space="preserve">  Étape : Programme, tranche, équipements et déblocages (modèle v5)</w:t>
+            </w:r>
+          </w:p>
+        </w:tc>
+        <w:tc>
+          <w:tcPr>
+            <w:tcW w:type="dxa" w:w="1100"/>
+            <w:tcMar>
+              <w:top w:type="dxa" w:w="40"/>
+              <w:left w:type="dxa" w:w="80"/>
+              <w:bottom w:type="dxa" w:w="40"/>
+              <w:right w:type="dxa" w:w="80"/>
+            </w:tcMar>
+          </w:tcPr>
+          <w:p>
+            <w:pPr>
+              <w:spacing w:after="0" w:line="240"/>
+              <w:jc w:val="center"/>
+            </w:pPr>
+            <w:r>
+              <w:rPr>
+                <w:rFonts w:ascii="Calibri" w:cs="Calibri" w:eastAsia="Calibri" w:hAnsi="Calibri"/>
+                <w:sz w:val="17"/>
+                <w:szCs w:val="17"/>
+              </w:rPr>
+              <w:t xml:space="preserve">P39, P18</w:t>
+            </w:r>
+          </w:p>
+        </w:tc>
+        <w:tc>
+          <w:tcPr>
+            <w:tcW w:type="dxa" w:w="4300"/>
+            <w:tcMar>
+              <w:top w:type="dxa" w:w="40"/>
+              <w:left w:type="dxa" w:w="80"/>
+              <w:bottom w:type="dxa" w:w="40"/>
+              <w:right w:type="dxa" w:w="80"/>
+            </w:tcMar>
+          </w:tcPr>
+          <w:p>
+            <w:pPr>
+              <w:spacing w:after="0" w:line="240"/>
+            </w:pPr>
+            <w:r>
+              <w:rPr>
+                <w:rFonts w:ascii="Calibri" w:cs="Calibri" w:eastAsia="Calibri" w:hAnsi="Calibri"/>
+                <w:sz w:val="17"/>
+                <w:szCs w:val="17"/>
+              </w:rPr>
+              <w:t xml:space="preserve">Lue dans le référentiel « Marché régional » (région administrative du programme × segment) par « Synchroniser vers le scoring ». À défaut de référentiel, apprécier sur l'étude de marché régionale.</w:t>
+            </w:r>
+          </w:p>
+        </w:tc>
+        <w:tc>
+          <w:tcPr>
+            <w:tcW w:type="dxa" w:w="2600"/>
+            <w:tcMar>
+              <w:top w:type="dxa" w:w="40"/>
+              <w:left w:type="dxa" w:w="80"/>
+              <w:bottom w:type="dxa" w:w="40"/>
+              <w:right w:type="dxa" w:w="80"/>
+            </w:tcMar>
+          </w:tcPr>
+          <w:p>
+            <w:pPr>
+              <w:spacing w:after="0" w:line="240"/>
+            </w:pPr>
+            <w:r>
+              <w:rPr>
+                <w:rFonts w:ascii="Calibri" w:cs="Calibri" w:eastAsia="Calibri" w:hAnsi="Calibri"/>
+                <w:sz w:val="15"/>
+                <w:szCs w:val="15"/>
+              </w:rPr>
+              <w:t xml:space="preserve">Marché en surstock (écoulement lent, prix sous pression) → 2 · Marché équilibré → 6 · Marché porteur (demande soutenue) → 10</w:t>
+            </w:r>
+          </w:p>
+        </w:tc>
+        <w:tc>
+          <w:tcPr>
+            <w:tcW w:type="dxa" w:w="3800"/>
+            <w:tcMar>
+              <w:top w:type="dxa" w:w="40"/>
+              <w:left w:type="dxa" w:w="80"/>
+              <w:bottom w:type="dxa" w:w="40"/>
+              <w:right w:type="dxa" w:w="80"/>
+            </w:tcMar>
+          </w:tcPr>
+          <w:p>
+            <w:pPr>
+              <w:spacing w:after="0" w:line="240"/>
+            </w:pPr>
+            <w:r>
+              <w:rPr>
+                <w:rFonts w:ascii="Calibri" w:cs="Calibri" w:eastAsia="Calibri" w:hAnsi="Calibri"/>
+                <w:sz w:val="17"/>
+                <w:szCs w:val="17"/>
+              </w:rPr>
+              <w:t xml:space="preserve">Une appréciation de plus de 12 mois est signalée périmée. Région non renseignée ou hors référentiel : donnée absente, note plancher.</w:t>
+            </w:r>
+          </w:p>
+        </w:tc>
+      </w:tr>
+      <w:tr>
+        <w:trPr>
+          <w:cantSplit/>
+        </w:trPr>
+        <w:tc>
+          <w:tcPr>
+            <w:tcW w:type="dxa" w:w="2600"/>
+            <w:shd w:fill="F2F5FB" w:color="auto" w:val="clear"/>
+            <w:tcMar>
+              <w:top w:type="dxa" w:w="40"/>
+              <w:left w:type="dxa" w:w="80"/>
+              <w:bottom w:type="dxa" w:w="40"/>
+              <w:right w:type="dxa" w:w="80"/>
+            </w:tcMar>
+          </w:tcPr>
+          <w:p>
+            <w:pPr>
+              <w:spacing w:after="0" w:line="240"/>
+            </w:pPr>
+            <w:r>
+              <w:rPr>
+                <w:rFonts w:ascii="Calibri" w:cs="Calibri" w:eastAsia="Calibri" w:hAnsi="Calibri"/>
+                <w:b/>
+                <w:bCs/>
+                <w:sz w:val="17"/>
+                <w:szCs w:val="17"/>
+              </w:rPr>
+              <w:t xml:space="preserve">Entreprise de travaux et garanties de marché</w:t>
+            </w:r>
+            <w:r>
+              <w:rPr>
+                <w:rFonts w:ascii="Calibri" w:cs="Calibri" w:eastAsia="Calibri" w:hAnsi="Calibri"/>
+                <w:color w:val="595959"/>
+                <w:sz w:val="14"/>
+                <w:szCs w:val="14"/>
+              </w:rPr>
+              <w:t xml:space="preserve">  D2C10 · contractor_quality</w:t>
+            </w:r>
+            <w:r>
+              <w:rPr>
+                <w:rFonts w:ascii="Calibri" w:cs="Calibri" w:eastAsia="Calibri" w:hAnsi="Calibri"/>
+                <w:i/>
+                <w:iCs/>
+                <w:color w:val="595959"/>
+                <w:sz w:val="14"/>
+                <w:szCs w:val="14"/>
+              </w:rPr>
+              <w:br/>
+              <w:t xml:space="preserve">  Étape : Programme, tranche, équipements et déblocages (modèle v5)</w:t>
+            </w:r>
+          </w:p>
+        </w:tc>
+        <w:tc>
+          <w:tcPr>
+            <w:tcW w:type="dxa" w:w="1100"/>
+            <w:shd w:fill="F2F5FB" w:color="auto" w:val="clear"/>
+            <w:tcMar>
+              <w:top w:type="dxa" w:w="40"/>
+              <w:left w:type="dxa" w:w="80"/>
+              <w:bottom w:type="dxa" w:w="40"/>
+              <w:right w:type="dxa" w:w="80"/>
+            </w:tcMar>
+          </w:tcPr>
+          <w:p>
+            <w:pPr>
+              <w:spacing w:after="0" w:line="240"/>
+              <w:jc w:val="center"/>
+            </w:pPr>
+            <w:r>
+              <w:rPr>
+                <w:rFonts w:ascii="Calibri" w:cs="Calibri" w:eastAsia="Calibri" w:hAnsi="Calibri"/>
+                <w:sz w:val="17"/>
+                <w:szCs w:val="17"/>
+              </w:rPr>
+              <w:t xml:space="preserve">P36, P19</w:t>
+            </w:r>
+          </w:p>
+        </w:tc>
+        <w:tc>
+          <w:tcPr>
+            <w:tcW w:type="dxa" w:w="4300"/>
+            <w:shd w:fill="F2F5FB" w:color="auto" w:val="clear"/>
+            <w:tcMar>
+              <w:top w:type="dxa" w:w="40"/>
+              <w:left w:type="dxa" w:w="80"/>
+              <w:bottom w:type="dxa" w:w="40"/>
+              <w:right w:type="dxa" w:w="80"/>
+            </w:tcMar>
+          </w:tcPr>
+          <w:p>
+            <w:pPr>
+              <w:spacing w:after="0" w:line="240"/>
+            </w:pPr>
+            <w:r>
+              <w:rPr>
+                <w:rFonts w:ascii="Calibri" w:cs="Calibri" w:eastAsia="Calibri" w:hAnsi="Calibri"/>
+                <w:sz w:val="17"/>
+                <w:szCs w:val="17"/>
+              </w:rPr>
+              <w:t xml:space="preserve">Choisir la modalité au vu du marché de travaux : qualification et classification de l'entreprise, marché forfaitaire ou en régie, caution de bonne exécution et retenue de garantie.</w:t>
+            </w:r>
+          </w:p>
+        </w:tc>
+        <w:tc>
+          <w:tcPr>
+            <w:tcW w:type="dxa" w:w="2600"/>
+            <w:shd w:fill="F2F5FB" w:color="auto" w:val="clear"/>
+            <w:tcMar>
+              <w:top w:type="dxa" w:w="40"/>
+              <w:left w:type="dxa" w:w="80"/>
+              <w:bottom w:type="dxa" w:w="40"/>
+              <w:right w:type="dxa" w:w="80"/>
+            </w:tcMar>
+          </w:tcPr>
+          <w:p>
+            <w:pPr>
+              <w:spacing w:after="0" w:line="240"/>
+            </w:pPr>
+            <w:r>
+              <w:rPr>
+                <w:rFonts w:ascii="Calibri" w:cs="Calibri" w:eastAsia="Calibri" w:hAnsi="Calibri"/>
+                <w:sz w:val="15"/>
+                <w:szCs w:val="15"/>
+              </w:rPr>
+              <w:t xml:space="preserve">Entreprise non qualifiée, travaux en régie ou promoteur-constructeur sans structure → 2 · Entreprise qualifiée, garanties de marché partielles → 6 · Entreprise qualifiée et classée, marché forfaitaire avec caution de bonne exécution et retenue de garantie → 10</w:t>
+            </w:r>
+          </w:p>
+        </w:tc>
+        <w:tc>
+          <w:tcPr>
+            <w:tcW w:type="dxa" w:w="3800"/>
+            <w:shd w:fill="F2F5FB" w:color="auto" w:val="clear"/>
+            <w:tcMar>
+              <w:top w:type="dxa" w:w="40"/>
+              <w:left w:type="dxa" w:w="80"/>
+              <w:bottom w:type="dxa" w:w="40"/>
+              <w:right w:type="dxa" w:w="80"/>
+            </w:tcMar>
+          </w:tcPr>
+          <w:p>
+            <w:pPr>
+              <w:spacing w:after="0" w:line="240"/>
+            </w:pPr>
+            <w:r>
+              <w:rPr>
+                <w:rFonts w:ascii="Calibri" w:cs="Calibri" w:eastAsia="Calibri" w:hAnsi="Calibri"/>
+                <w:sz w:val="17"/>
+                <w:szCs w:val="17"/>
+              </w:rPr>
+              <w:t xml:space="preserve">Un promoteur qui construit lui-même sans structure dédiée relève de « non qualifiée ».</w:t>
+            </w:r>
+          </w:p>
+        </w:tc>
+      </w:tr>
+      <w:tr>
+        <w:trPr>
+          <w:cantSplit/>
+        </w:trPr>
+        <w:tc>
+          <w:tcPr>
+            <w:tcW w:type="dxa" w:w="2600"/>
+            <w:tcMar>
+              <w:top w:type="dxa" w:w="40"/>
+              <w:left w:type="dxa" w:w="80"/>
+              <w:bottom w:type="dxa" w:w="40"/>
+              <w:right w:type="dxa" w:w="80"/>
+            </w:tcMar>
+          </w:tcPr>
+          <w:p>
+            <w:pPr>
+              <w:spacing w:after="0" w:line="240"/>
+            </w:pPr>
+            <w:r>
+              <w:rPr>
+                <w:rFonts w:ascii="Calibri" w:cs="Calibri" w:eastAsia="Calibri" w:hAnsi="Calibri"/>
+                <w:b/>
+                <w:bCs/>
+                <w:sz w:val="17"/>
+                <w:szCs w:val="17"/>
+              </w:rPr>
+              <w:t xml:space="preserve">Équipements exigés non budgétés (% du coût)</w:t>
+            </w:r>
+            <w:r>
+              <w:rPr>
+                <w:rFonts w:ascii="Calibri" w:cs="Calibri" w:eastAsia="Calibri" w:hAnsi="Calibri"/>
+                <w:color w:val="595959"/>
+                <w:sz w:val="14"/>
+                <w:szCs w:val="14"/>
+              </w:rPr>
+              <w:t xml:space="preserve">  D2C11 · equipment_unbudgeted_pct</w:t>
+            </w:r>
+            <w:r>
+              <w:rPr>
+                <w:rFonts w:ascii="Calibri" w:cs="Calibri" w:eastAsia="Calibri" w:hAnsi="Calibri"/>
+                <w:i/>
+                <w:iCs/>
+                <w:color w:val="595959"/>
+                <w:sz w:val="14"/>
+                <w:szCs w:val="14"/>
+              </w:rPr>
+              <w:br/>
+              <w:t xml:space="preserve">  Étape : Programme, tranche, équipements et déblocages (modèle v5)</w:t>
+            </w:r>
+          </w:p>
+        </w:tc>
+        <w:tc>
+          <w:tcPr>
+            <w:tcW w:type="dxa" w:w="1100"/>
+            <w:tcMar>
+              <w:top w:type="dxa" w:w="40"/>
+              <w:left w:type="dxa" w:w="80"/>
+              <w:bottom w:type="dxa" w:w="40"/>
+              <w:right w:type="dxa" w:w="80"/>
+            </w:tcMar>
+          </w:tcPr>
+          <w:p>
+            <w:pPr>
+              <w:spacing w:after="0" w:line="240"/>
+              <w:jc w:val="center"/>
+            </w:pPr>
+            <w:r>
+              <w:rPr>
+                <w:rFonts w:ascii="Calibri" w:cs="Calibri" w:eastAsia="Calibri" w:hAnsi="Calibri"/>
+                <w:sz w:val="17"/>
+                <w:szCs w:val="17"/>
+              </w:rPr>
+              <w:t xml:space="preserve">P35, P16</w:t>
+            </w:r>
+          </w:p>
+        </w:tc>
+        <w:tc>
+          <w:tcPr>
+            <w:tcW w:type="dxa" w:w="4300"/>
+            <w:tcMar>
+              <w:top w:type="dxa" w:w="40"/>
+              <w:left w:type="dxa" w:w="80"/>
+              <w:bottom w:type="dxa" w:w="40"/>
+              <w:right w:type="dxa" w:w="80"/>
+            </w:tcMar>
+          </w:tcPr>
+          <w:p>
+            <w:pPr>
+              <w:spacing w:after="0" w:line="240"/>
+            </w:pPr>
+            <w:r>
+              <w:rPr>
+                <w:rFonts w:ascii="Calibri" w:cs="Calibri" w:eastAsia="Calibri" w:hAnsi="Calibri"/>
+                <w:sz w:val="17"/>
+                <w:szCs w:val="17"/>
+              </w:rPr>
+              <w:t xml:space="preserve">Calculé par la synchronisation : coût des équipements exigés non budgétés et à la charge du programme / coût total × 100. Saisir les équipements dans Suivi › « Programme, tranche financée, équipements ».</w:t>
+            </w:r>
+          </w:p>
+        </w:tc>
+        <w:tc>
+          <w:tcPr>
+            <w:tcW w:type="dxa" w:w="2600"/>
+            <w:tcMar>
+              <w:top w:type="dxa" w:w="40"/>
+              <w:left w:type="dxa" w:w="80"/>
+              <w:bottom w:type="dxa" w:w="40"/>
+              <w:right w:type="dxa" w:w="80"/>
+            </w:tcMar>
+          </w:tcPr>
+          <w:p>
+            <w:pPr>
+              <w:spacing w:after="0" w:line="240"/>
+            </w:pPr>
+            <w:r>
+              <w:rPr>
+                <w:rFonts w:ascii="Calibri" w:cs="Calibri" w:eastAsia="Calibri" w:hAnsi="Calibri"/>
+                <w:sz w:val="15"/>
+                <w:szCs w:val="15"/>
+              </w:rPr>
+              <w:t xml:space="preserve">0 % — tout est budgété → 10 · &gt; 0 à &lt; 3 % → 6 · ≥ 3 % → 1</w:t>
+            </w:r>
+          </w:p>
+        </w:tc>
+        <w:tc>
+          <w:tcPr>
+            <w:tcW w:type="dxa" w:w="3800"/>
+            <w:tcMar>
+              <w:top w:type="dxa" w:w="40"/>
+              <w:left w:type="dxa" w:w="80"/>
+              <w:bottom w:type="dxa" w:w="40"/>
+              <w:right w:type="dxa" w:w="80"/>
+            </w:tcMar>
+          </w:tcPr>
+          <w:p>
+            <w:pPr>
+              <w:spacing w:after="0" w:line="240"/>
+            </w:pPr>
+            <w:r>
+              <w:rPr>
+                <w:rFonts w:ascii="Calibri" w:cs="Calibri" w:eastAsia="Calibri" w:hAnsi="Calibri"/>
+                <w:sz w:val="17"/>
+                <w:szCs w:val="17"/>
+              </w:rPr>
+              <w:t xml:space="preserve">Équipements non déclarés = donnée absente (note plancher). S'il n'y en a aucun, le déclarer explicitement. Un équipement financé par la commune est exclu.</w:t>
+            </w:r>
+          </w:p>
+        </w:tc>
+      </w:tr>
+      <w:tr>
+        <w:trPr>
+          <w:cantSplit/>
+        </w:trPr>
+        <w:tc>
+          <w:tcPr>
+            <w:tcW w:type="dxa" w:w="2600"/>
+            <w:shd w:fill="F2F5FB" w:color="auto" w:val="clear"/>
+            <w:tcMar>
+              <w:top w:type="dxa" w:w="40"/>
+              <w:left w:type="dxa" w:w="80"/>
+              <w:bottom w:type="dxa" w:w="40"/>
+              <w:right w:type="dxa" w:w="80"/>
+            </w:tcMar>
+          </w:tcPr>
+          <w:p>
+            <w:pPr>
+              <w:spacing w:after="0" w:line="240"/>
+            </w:pPr>
+            <w:r>
+              <w:rPr>
+                <w:rFonts w:ascii="Calibri" w:cs="Calibri" w:eastAsia="Calibri" w:hAnsi="Calibri"/>
+                <w:b/>
+                <w:bCs/>
+                <w:sz w:val="17"/>
+                <w:szCs w:val="17"/>
+              </w:rPr>
+              <w:t xml:space="preserve">Autonomie du périmètre financé (tranche)</w:t>
+            </w:r>
+            <w:r>
+              <w:rPr>
+                <w:rFonts w:ascii="Calibri" w:cs="Calibri" w:eastAsia="Calibri" w:hAnsi="Calibri"/>
+                <w:color w:val="595959"/>
+                <w:sz w:val="14"/>
+                <w:szCs w:val="14"/>
+              </w:rPr>
+              <w:t xml:space="preserve">  D2C12 · tranche_dependency</w:t>
+            </w:r>
+            <w:r>
+              <w:rPr>
+                <w:rFonts w:ascii="Calibri" w:cs="Calibri" w:eastAsia="Calibri" w:hAnsi="Calibri"/>
+                <w:i/>
+                <w:iCs/>
+                <w:color w:val="595959"/>
+                <w:sz w:val="14"/>
+                <w:szCs w:val="14"/>
+              </w:rPr>
+              <w:br/>
+              <w:t xml:space="preserve">  Étape : Programme, tranche, équipements et déblocages (modèle v5)</w:t>
+            </w:r>
+          </w:p>
+        </w:tc>
+        <w:tc>
+          <w:tcPr>
+            <w:tcW w:type="dxa" w:w="1100"/>
+            <w:shd w:fill="F2F5FB" w:color="auto" w:val="clear"/>
+            <w:tcMar>
+              <w:top w:type="dxa" w:w="40"/>
+              <w:left w:type="dxa" w:w="80"/>
+              <w:bottom w:type="dxa" w:w="40"/>
+              <w:right w:type="dxa" w:w="80"/>
+            </w:tcMar>
+          </w:tcPr>
+          <w:p>
+            <w:pPr>
+              <w:spacing w:after="0" w:line="240"/>
+              <w:jc w:val="center"/>
+            </w:pPr>
+            <w:r>
+              <w:rPr>
+                <w:rFonts w:ascii="Calibri" w:cs="Calibri" w:eastAsia="Calibri" w:hAnsi="Calibri"/>
+                <w:sz w:val="17"/>
+                <w:szCs w:val="17"/>
+              </w:rPr>
+              <w:t xml:space="preserve">P34</w:t>
+            </w:r>
+          </w:p>
+        </w:tc>
+        <w:tc>
+          <w:tcPr>
+            <w:tcW w:type="dxa" w:w="4300"/>
+            <w:shd w:fill="F2F5FB" w:color="auto" w:val="clear"/>
+            <w:tcMar>
+              <w:top w:type="dxa" w:w="40"/>
+              <w:left w:type="dxa" w:w="80"/>
+              <w:bottom w:type="dxa" w:w="40"/>
+              <w:right w:type="dxa" w:w="80"/>
+            </w:tcMar>
+          </w:tcPr>
+          <w:p>
+            <w:pPr>
+              <w:spacing w:after="0" w:line="240"/>
+            </w:pPr>
+            <w:r>
+              <w:rPr>
+                <w:rFonts w:ascii="Calibri" w:cs="Calibri" w:eastAsia="Calibri" w:hAnsi="Calibri"/>
+                <w:sz w:val="17"/>
+                <w:szCs w:val="17"/>
+              </w:rPr>
+              <w:t xml:space="preserve">Programme entier financé : renseigné automatiquement. Financement d'une tranche : apprécier si elle peut être achevée, livrée et vendue sans les ouvrages communs d'autres tranches.</w:t>
+            </w:r>
+          </w:p>
+        </w:tc>
+        <w:tc>
+          <w:tcPr>
+            <w:tcW w:type="dxa" w:w="2600"/>
+            <w:shd w:fill="F2F5FB" w:color="auto" w:val="clear"/>
+            <w:tcMar>
+              <w:top w:type="dxa" w:w="40"/>
+              <w:left w:type="dxa" w:w="80"/>
+              <w:bottom w:type="dxa" w:w="40"/>
+              <w:right w:type="dxa" w:w="80"/>
+            </w:tcMar>
+          </w:tcPr>
+          <w:p>
+            <w:pPr>
+              <w:spacing w:after="0" w:line="240"/>
+            </w:pPr>
+            <w:r>
+              <w:rPr>
+                <w:rFonts w:ascii="Calibri" w:cs="Calibri" w:eastAsia="Calibri" w:hAnsi="Calibri"/>
+                <w:sz w:val="15"/>
+                <w:szCs w:val="15"/>
+              </w:rPr>
+              <w:t xml:space="preserve">Tranche dépendante d'ouvrages communs non financés → 1 · Tranche dépendante d'ouvrages communs financés ou réalisés → 6 · Tranche autonome (accès, VRD et raccordements propres) → 10 · Financement du programme entier → 10</w:t>
+            </w:r>
+          </w:p>
+        </w:tc>
+        <w:tc>
+          <w:tcPr>
+            <w:tcW w:type="dxa" w:w="3800"/>
+            <w:shd w:fill="F2F5FB" w:color="auto" w:val="clear"/>
+            <w:tcMar>
+              <w:top w:type="dxa" w:w="40"/>
+              <w:left w:type="dxa" w:w="80"/>
+              <w:bottom w:type="dxa" w:w="40"/>
+              <w:right w:type="dxa" w:w="80"/>
+            </w:tcMar>
+          </w:tcPr>
+          <w:p>
+            <w:pPr>
+              <w:spacing w:after="0" w:line="240"/>
+            </w:pPr>
+            <w:r>
+              <w:rPr>
+                <w:rFonts w:ascii="Calibri" w:cs="Calibri" w:eastAsia="Calibri" w:hAnsi="Calibri"/>
+                <w:sz w:val="17"/>
+                <w:szCs w:val="17"/>
+              </w:rPr>
+              <w:t xml:space="preserve">« Dépendante d'ouvrages non financés » déclenche une alerte avec retour en comité : exiger le financement ou la réalisation préalable des ouvrages communs.</w:t>
+            </w:r>
+          </w:p>
+        </w:tc>
+      </w:tr>
     </w:tbl>
     <w:p>
       <w:pPr>
@@ -12033,6 +13411,309 @@
                 <w:szCs w:val="17"/>
               </w:rPr>
               <w:t xml:space="preserve">Une réservation dont le crédit n'est pas instruit ne vaut que 20 % ; un crédit refusé vaut 0.</w:t>
+            </w:r>
+          </w:p>
+        </w:tc>
+      </w:tr>
+      <w:tr>
+        <w:trPr>
+          <w:cantSplit/>
+        </w:trPr>
+        <w:tc>
+          <w:tcPr>
+            <w:tcW w:type="dxa" w:w="2600"/>
+            <w:tcMar>
+              <w:top w:type="dxa" w:w="40"/>
+              <w:left w:type="dxa" w:w="80"/>
+              <w:bottom w:type="dxa" w:w="40"/>
+              <w:right w:type="dxa" w:w="80"/>
+            </w:tcMar>
+          </w:tcPr>
+          <w:p>
+            <w:pPr>
+              <w:spacing w:after="0" w:line="240"/>
+            </w:pPr>
+            <w:r>
+              <w:rPr>
+                <w:rFonts w:ascii="Calibri" w:cs="Calibri" w:eastAsia="Calibri" w:hAnsi="Calibri"/>
+                <w:b/>
+                <w:bCs/>
+                <w:sz w:val="17"/>
+                <w:szCs w:val="17"/>
+              </w:rPr>
+              <w:t xml:space="preserve">Part du CA en commerces, bureaux, hôtel (%)</w:t>
+            </w:r>
+            <w:r>
+              <w:rPr>
+                <w:rFonts w:ascii="Calibri" w:cs="Calibri" w:eastAsia="Calibri" w:hAnsi="Calibri"/>
+                <w:color w:val="595959"/>
+                <w:sz w:val="14"/>
+                <w:szCs w:val="14"/>
+              </w:rPr>
+              <w:t xml:space="preserve">  D3C9 · slow_liquidity_share_pct</w:t>
+            </w:r>
+            <w:r>
+              <w:rPr>
+                <w:rFonts w:ascii="Calibri" w:cs="Calibri" w:eastAsia="Calibri" w:hAnsi="Calibri"/>
+                <w:i/>
+                <w:iCs/>
+                <w:color w:val="595959"/>
+                <w:sz w:val="14"/>
+                <w:szCs w:val="14"/>
+              </w:rPr>
+              <w:br/>
+              <w:t xml:space="preserve">  Étape : Programme, tranche, équipements et déblocages (modèle v5)</w:t>
+            </w:r>
+          </w:p>
+        </w:tc>
+        <w:tc>
+          <w:tcPr>
+            <w:tcW w:type="dxa" w:w="1100"/>
+            <w:tcMar>
+              <w:top w:type="dxa" w:w="40"/>
+              <w:left w:type="dxa" w:w="80"/>
+              <w:bottom w:type="dxa" w:w="40"/>
+              <w:right w:type="dxa" w:w="80"/>
+            </w:tcMar>
+          </w:tcPr>
+          <w:p>
+            <w:pPr>
+              <w:spacing w:after="0" w:line="240"/>
+              <w:jc w:val="center"/>
+            </w:pPr>
+            <w:r>
+              <w:rPr>
+                <w:rFonts w:ascii="Calibri" w:cs="Calibri" w:eastAsia="Calibri" w:hAnsi="Calibri"/>
+                <w:sz w:val="17"/>
+                <w:szCs w:val="17"/>
+              </w:rPr>
+              <w:t xml:space="preserve">P22, P38</w:t>
+            </w:r>
+          </w:p>
+        </w:tc>
+        <w:tc>
+          <w:tcPr>
+            <w:tcW w:type="dxa" w:w="4300"/>
+            <w:tcMar>
+              <w:top w:type="dxa" w:w="40"/>
+              <w:left w:type="dxa" w:w="80"/>
+              <w:bottom w:type="dxa" w:w="40"/>
+              <w:right w:type="dxa" w:w="80"/>
+            </w:tcMar>
+          </w:tcPr>
+          <w:p>
+            <w:pPr>
+              <w:spacing w:after="0" w:line="240"/>
+            </w:pPr>
+            <w:r>
+              <w:rPr>
+                <w:rFonts w:ascii="Calibri" w:cs="Calibri" w:eastAsia="Calibri" w:hAnsi="Calibri"/>
+                <w:sz w:val="17"/>
+                <w:szCs w:val="17"/>
+              </w:rPr>
+              <w:t xml:space="preserve">Calculé par la synchronisation : prix des commerces, bureaux et composantes hôtelières / prix de tous les lots du périmètre financé × 100.</w:t>
+            </w:r>
+          </w:p>
+        </w:tc>
+        <w:tc>
+          <w:tcPr>
+            <w:tcW w:type="dxa" w:w="2600"/>
+            <w:tcMar>
+              <w:top w:type="dxa" w:w="40"/>
+              <w:left w:type="dxa" w:w="80"/>
+              <w:bottom w:type="dxa" w:w="40"/>
+              <w:right w:type="dxa" w:w="80"/>
+            </w:tcMar>
+          </w:tcPr>
+          <w:p>
+            <w:pPr>
+              <w:spacing w:after="0" w:line="240"/>
+            </w:pPr>
+            <w:r>
+              <w:rPr>
+                <w:rFonts w:ascii="Calibri" w:cs="Calibri" w:eastAsia="Calibri" w:hAnsi="Calibri"/>
+                <w:sz w:val="15"/>
+                <w:szCs w:val="15"/>
+              </w:rPr>
+              <w:t xml:space="preserve">&lt; 20 % → 10 · 20 à &lt; 40 % → 6 · ≥ 40 % → 1</w:t>
+            </w:r>
+          </w:p>
+        </w:tc>
+        <w:tc>
+          <w:tcPr>
+            <w:tcW w:type="dxa" w:w="3800"/>
+            <w:tcMar>
+              <w:top w:type="dxa" w:w="40"/>
+              <w:left w:type="dxa" w:w="80"/>
+              <w:bottom w:type="dxa" w:w="40"/>
+              <w:right w:type="dxa" w:w="80"/>
+            </w:tcMar>
+          </w:tcPr>
+          <w:p>
+            <w:pPr>
+              <w:spacing w:after="0" w:line="240"/>
+            </w:pPr>
+            <w:r>
+              <w:rPr>
+                <w:rFonts w:ascii="Calibri" w:cs="Calibri" w:eastAsia="Calibri" w:hAnsi="Calibri"/>
+                <w:sz w:val="17"/>
+                <w:szCs w:val="17"/>
+              </w:rPr>
+              <w:t xml:space="preserve">Saisir les lots avec leur type exact (commerce, bureau, hôtel) ; un hôtel vendu en bloc est un lot unique de type « Hôtel ».</w:t>
+            </w:r>
+          </w:p>
+        </w:tc>
+      </w:tr>
+      <w:tr>
+        <w:trPr>
+          <w:cantSplit/>
+        </w:trPr>
+        <w:tc>
+          <w:tcPr>
+            <w:tcW w:type="dxa" w:w="2600"/>
+            <w:shd w:fill="F2F5FB" w:color="auto" w:val="clear"/>
+            <w:tcMar>
+              <w:top w:type="dxa" w:w="40"/>
+              <w:left w:type="dxa" w:w="80"/>
+              <w:bottom w:type="dxa" w:w="40"/>
+              <w:right w:type="dxa" w:w="80"/>
+            </w:tcMar>
+          </w:tcPr>
+          <w:p>
+            <w:pPr>
+              <w:spacing w:after="0" w:line="240"/>
+            </w:pPr>
+            <w:r>
+              <w:rPr>
+                <w:rFonts w:ascii="Calibri" w:cs="Calibri" w:eastAsia="Calibri" w:hAnsi="Calibri"/>
+                <w:b/>
+                <w:bCs/>
+                <w:sz w:val="17"/>
+                <w:szCs w:val="17"/>
+              </w:rPr>
+              <w:t xml:space="preserve">Taux de désistement des réservations (%)</w:t>
+            </w:r>
+            <w:r>
+              <w:rPr>
+                <w:rFonts w:ascii="Calibri" w:cs="Calibri" w:eastAsia="Calibri" w:hAnsi="Calibri"/>
+                <w:color w:val="595959"/>
+                <w:sz w:val="14"/>
+                <w:szCs w:val="14"/>
+              </w:rPr>
+              <w:t xml:space="preserve">  D3C10 · cancellation_rate_pct</w:t>
+            </w:r>
+            <w:r>
+              <w:rPr>
+                <w:rFonts w:ascii="Calibri" w:cs="Calibri" w:eastAsia="Calibri" w:hAnsi="Calibri"/>
+                <w:i/>
+                <w:iCs/>
+                <w:color w:val="595959"/>
+                <w:sz w:val="14"/>
+                <w:szCs w:val="14"/>
+              </w:rPr>
+              <w:br/>
+              <w:t xml:space="preserve">  Étape : Programme, tranche, équipements et déblocages (modèle v5)</w:t>
+            </w:r>
+          </w:p>
+        </w:tc>
+        <w:tc>
+          <w:tcPr>
+            <w:tcW w:type="dxa" w:w="1100"/>
+            <w:shd w:fill="F2F5FB" w:color="auto" w:val="clear"/>
+            <w:tcMar>
+              <w:top w:type="dxa" w:w="40"/>
+              <w:left w:type="dxa" w:w="80"/>
+              <w:bottom w:type="dxa" w:w="40"/>
+              <w:right w:type="dxa" w:w="80"/>
+            </w:tcMar>
+          </w:tcPr>
+          <w:p>
+            <w:pPr>
+              <w:spacing w:after="0" w:line="240"/>
+              <w:jc w:val="center"/>
+            </w:pPr>
+            <w:r>
+              <w:rPr>
+                <w:rFonts w:ascii="Calibri" w:cs="Calibri" w:eastAsia="Calibri" w:hAnsi="Calibri"/>
+                <w:sz w:val="17"/>
+                <w:szCs w:val="17"/>
+              </w:rPr>
+              <w:t xml:space="preserve">P22, P25</w:t>
+            </w:r>
+          </w:p>
+        </w:tc>
+        <w:tc>
+          <w:tcPr>
+            <w:tcW w:type="dxa" w:w="4300"/>
+            <w:shd w:fill="F2F5FB" w:color="auto" w:val="clear"/>
+            <w:tcMar>
+              <w:top w:type="dxa" w:w="40"/>
+              <w:left w:type="dxa" w:w="80"/>
+              <w:bottom w:type="dxa" w:w="40"/>
+              <w:right w:type="dxa" w:w="80"/>
+            </w:tcMar>
+          </w:tcPr>
+          <w:p>
+            <w:pPr>
+              <w:spacing w:after="0" w:line="240"/>
+            </w:pPr>
+            <w:r>
+              <w:rPr>
+                <w:rFonts w:ascii="Calibri" w:cs="Calibri" w:eastAsia="Calibri" w:hAnsi="Calibri"/>
+                <w:sz w:val="17"/>
+                <w:szCs w:val="17"/>
+              </w:rPr>
+              <w:t xml:space="preserve">Calculé par la synchronisation : lots désistés / (lots engagés + désistés) × 100, sur le périmètre financé.</w:t>
+            </w:r>
+          </w:p>
+        </w:tc>
+        <w:tc>
+          <w:tcPr>
+            <w:tcW w:type="dxa" w:w="2600"/>
+            <w:shd w:fill="F2F5FB" w:color="auto" w:val="clear"/>
+            <w:tcMar>
+              <w:top w:type="dxa" w:w="40"/>
+              <w:left w:type="dxa" w:w="80"/>
+              <w:bottom w:type="dxa" w:w="40"/>
+              <w:right w:type="dxa" w:w="80"/>
+            </w:tcMar>
+          </w:tcPr>
+          <w:p>
+            <w:pPr>
+              <w:spacing w:after="0" w:line="240"/>
+            </w:pPr>
+            <w:r>
+              <w:rPr>
+                <w:rFonts w:ascii="Calibri" w:cs="Calibri" w:eastAsia="Calibri" w:hAnsi="Calibri"/>
+                <w:sz w:val="15"/>
+                <w:szCs w:val="15"/>
+              </w:rPr>
+              <w:t xml:space="preserve">&lt; 10 % → 10 · 10 à &lt; 20 % → 6 · ≥ 20 % → 1</w:t>
+            </w:r>
+          </w:p>
+        </w:tc>
+        <w:tc>
+          <w:tcPr>
+            <w:tcW w:type="dxa" w:w="3800"/>
+            <w:shd w:fill="F2F5FB" w:color="auto" w:val="clear"/>
+            <w:tcMar>
+              <w:top w:type="dxa" w:w="40"/>
+              <w:left w:type="dxa" w:w="80"/>
+              <w:bottom w:type="dxa" w:w="40"/>
+              <w:right w:type="dxa" w:w="80"/>
+            </w:tcMar>
+          </w:tcPr>
+          <w:p>
+            <w:pPr>
+              <w:spacing w:after="0" w:line="240"/>
+            </w:pPr>
+            <w:r>
+              <w:rPr>
+                <w:rFonts w:ascii="Calibri" w:cs="Calibri" w:eastAsia="Calibri" w:hAnsi="Calibri"/>
+                <w:sz w:val="17"/>
+                <w:szCs w:val="17"/>
+              </w:rPr>
+              <w:t xml:space="preserve">Un taux qui monte entre deux revues signale des préventes fragiles, même si le taux de prévente reste stable.</w:t>
             </w:r>
           </w:p>
         </w:tc>
@@ -13326,6 +15007,320 @@
           </w:p>
         </w:tc>
       </w:tr>
+      <w:tr>
+        <w:trPr>
+          <w:cantSplit/>
+        </w:trPr>
+        <w:tc>
+          <w:tcPr>
+            <w:tcW w:type="dxa" w:w="2600"/>
+            <w:shd w:fill="F2F5FB" w:color="auto" w:val="clear"/>
+            <w:tcMar>
+              <w:top w:type="dxa" w:w="40"/>
+              <w:left w:type="dxa" w:w="80"/>
+              <w:bottom w:type="dxa" w:w="40"/>
+              <w:right w:type="dxa" w:w="80"/>
+            </w:tcMar>
+          </w:tcPr>
+          <w:p>
+            <w:pPr>
+              <w:spacing w:after="0" w:line="240"/>
+            </w:pPr>
+            <w:r>
+              <w:rPr>
+                <w:rFonts w:ascii="Calibri" w:cs="Calibri" w:eastAsia="Calibri" w:hAnsi="Calibri"/>
+                <w:b/>
+                <w:bCs/>
+                <w:color w:val="2E5496"/>
+                <w:sz w:val="17"/>
+                <w:szCs w:val="17"/>
+              </w:rPr>
+              <w:t xml:space="preserve">S </w:t>
+            </w:r>
+            <w:r>
+              <w:rPr>
+                <w:rFonts w:ascii="Calibri" w:cs="Calibri" w:eastAsia="Calibri" w:hAnsi="Calibri"/>
+                <w:b/>
+                <w:bCs/>
+                <w:sz w:val="17"/>
+                <w:szCs w:val="17"/>
+              </w:rPr>
+              <w:t xml:space="preserve">Déblocages vs avancement certifié (%)</w:t>
+            </w:r>
+            <w:r>
+              <w:rPr>
+                <w:rFonts w:ascii="Calibri" w:cs="Calibri" w:eastAsia="Calibri" w:hAnsi="Calibri"/>
+                <w:color w:val="595959"/>
+                <w:sz w:val="14"/>
+                <w:szCs w:val="14"/>
+              </w:rPr>
+              <w:t xml:space="preserve">  D4C8 · drawdown_vs_progress_pct</w:t>
+            </w:r>
+            <w:r>
+              <w:rPr>
+                <w:rFonts w:ascii="Calibri" w:cs="Calibri" w:eastAsia="Calibri" w:hAnsi="Calibri"/>
+                <w:i/>
+                <w:iCs/>
+                <w:color w:val="595959"/>
+                <w:sz w:val="14"/>
+                <w:szCs w:val="14"/>
+              </w:rPr>
+              <w:br/>
+              <w:t xml:space="preserve">  Étape : Programme, tranche, équipements et déblocages (modèle v5)</w:t>
+            </w:r>
+          </w:p>
+        </w:tc>
+        <w:tc>
+          <w:tcPr>
+            <w:tcW w:type="dxa" w:w="1100"/>
+            <w:shd w:fill="F2F5FB" w:color="auto" w:val="clear"/>
+            <w:tcMar>
+              <w:top w:type="dxa" w:w="40"/>
+              <w:left w:type="dxa" w:w="80"/>
+              <w:bottom w:type="dxa" w:w="40"/>
+              <w:right w:type="dxa" w:w="80"/>
+            </w:tcMar>
+          </w:tcPr>
+          <w:p>
+            <w:pPr>
+              <w:spacing w:after="0" w:line="240"/>
+              <w:jc w:val="center"/>
+            </w:pPr>
+            <w:r>
+              <w:rPr>
+                <w:rFonts w:ascii="Calibri" w:cs="Calibri" w:eastAsia="Calibri" w:hAnsi="Calibri"/>
+                <w:sz w:val="17"/>
+                <w:szCs w:val="17"/>
+              </w:rPr>
+              <w:t xml:space="preserve">P21, P26</w:t>
+            </w:r>
+          </w:p>
+        </w:tc>
+        <w:tc>
+          <w:tcPr>
+            <w:tcW w:type="dxa" w:w="4300"/>
+            <w:shd w:fill="F2F5FB" w:color="auto" w:val="clear"/>
+            <w:tcMar>
+              <w:top w:type="dxa" w:w="40"/>
+              <w:left w:type="dxa" w:w="80"/>
+              <w:bottom w:type="dxa" w:w="40"/>
+              <w:right w:type="dxa" w:w="80"/>
+            </w:tcMar>
+          </w:tcPr>
+          <w:p>
+            <w:pPr>
+              <w:spacing w:after="0" w:line="240"/>
+            </w:pPr>
+            <w:r>
+              <w:rPr>
+                <w:rFonts w:ascii="Calibri" w:cs="Calibri" w:eastAsia="Calibri" w:hAnsi="Calibri"/>
+                <w:sz w:val="17"/>
+                <w:szCs w:val="17"/>
+              </w:rPr>
+              <w:t xml:space="preserve">Calculé par la synchronisation : cumul débloqué sur les crédits de travaux / (autorisé × avancement certifié) × 100. Avancement : situation de travaux visée, sinon avancement des tranches financées, sinon dernière visite.</w:t>
+            </w:r>
+          </w:p>
+        </w:tc>
+        <w:tc>
+          <w:tcPr>
+            <w:tcW w:type="dxa" w:w="2600"/>
+            <w:shd w:fill="F2F5FB" w:color="auto" w:val="clear"/>
+            <w:tcMar>
+              <w:top w:type="dxa" w:w="40"/>
+              <w:left w:type="dxa" w:w="80"/>
+              <w:bottom w:type="dxa" w:w="40"/>
+              <w:right w:type="dxa" w:w="80"/>
+            </w:tcMar>
+          </w:tcPr>
+          <w:p>
+            <w:pPr>
+              <w:spacing w:after="0" w:line="240"/>
+            </w:pPr>
+            <w:r>
+              <w:rPr>
+                <w:rFonts w:ascii="Calibri" w:cs="Calibri" w:eastAsia="Calibri" w:hAnsi="Calibri"/>
+                <w:sz w:val="15"/>
+                <w:szCs w:val="15"/>
+              </w:rPr>
+              <w:t xml:space="preserve">&lt; 105 % — en phase → 10 · 105 à &lt; 115 % → 6 · ≥ 115 % — tirages en avance → 1</w:t>
+            </w:r>
+          </w:p>
+        </w:tc>
+        <w:tc>
+          <w:tcPr>
+            <w:tcW w:type="dxa" w:w="3800"/>
+            <w:shd w:fill="F2F5FB" w:color="auto" w:val="clear"/>
+            <w:tcMar>
+              <w:top w:type="dxa" w:w="40"/>
+              <w:left w:type="dxa" w:w="80"/>
+              <w:bottom w:type="dxa" w:w="40"/>
+              <w:right w:type="dxa" w:w="80"/>
+            </w:tcMar>
+          </w:tcPr>
+          <w:p>
+            <w:pPr>
+              <w:spacing w:after="0" w:line="240"/>
+            </w:pPr>
+            <w:r>
+              <w:rPr>
+                <w:rFonts w:ascii="Calibri" w:cs="Calibri" w:eastAsia="Calibri" w:hAnsi="Calibri"/>
+                <w:sz w:val="17"/>
+                <w:szCs w:val="17"/>
+              </w:rPr>
+              <w:t xml:space="preserve">≥ 115 % : la banque a financé plus que les travaux réalisés (alerte « tirages en avance »). Rattacher chaque facilité à sa tranche.</w:t>
+            </w:r>
+          </w:p>
+        </w:tc>
+      </w:tr>
+      <w:tr>
+        <w:trPr>
+          <w:cantSplit/>
+        </w:trPr>
+        <w:tc>
+          <w:tcPr>
+            <w:tcW w:type="dxa" w:w="2600"/>
+            <w:tcMar>
+              <w:top w:type="dxa" w:w="40"/>
+              <w:left w:type="dxa" w:w="80"/>
+              <w:bottom w:type="dxa" w:w="40"/>
+              <w:right w:type="dxa" w:w="80"/>
+            </w:tcMar>
+          </w:tcPr>
+          <w:p>
+            <w:pPr>
+              <w:spacing w:after="0" w:line="240"/>
+            </w:pPr>
+            <w:r>
+              <w:rPr>
+                <w:rFonts w:ascii="Calibri" w:cs="Calibri" w:eastAsia="Calibri" w:hAnsi="Calibri"/>
+                <w:b/>
+                <w:bCs/>
+                <w:sz w:val="17"/>
+                <w:szCs w:val="17"/>
+              </w:rPr>
+              <w:t xml:space="preserve">Dépassement du coût à terminaison (%)</w:t>
+            </w:r>
+            <w:r>
+              <w:rPr>
+                <w:rFonts w:ascii="Calibri" w:cs="Calibri" w:eastAsia="Calibri" w:hAnsi="Calibri"/>
+                <w:color w:val="595959"/>
+                <w:sz w:val="14"/>
+                <w:szCs w:val="14"/>
+              </w:rPr>
+              <w:t xml:space="preserve">  D4C9 · cost_overrun_pct</w:t>
+            </w:r>
+            <w:r>
+              <w:rPr>
+                <w:rFonts w:ascii="Calibri" w:cs="Calibri" w:eastAsia="Calibri" w:hAnsi="Calibri"/>
+                <w:i/>
+                <w:iCs/>
+                <w:color w:val="595959"/>
+                <w:sz w:val="14"/>
+                <w:szCs w:val="14"/>
+              </w:rPr>
+              <w:br/>
+              <w:t xml:space="preserve">  Étape : Programme, tranche, équipements et déblocages (modèle v5)</w:t>
+            </w:r>
+          </w:p>
+        </w:tc>
+        <w:tc>
+          <w:tcPr>
+            <w:tcW w:type="dxa" w:w="1100"/>
+            <w:tcMar>
+              <w:top w:type="dxa" w:w="40"/>
+              <w:left w:type="dxa" w:w="80"/>
+              <w:bottom w:type="dxa" w:w="40"/>
+              <w:right w:type="dxa" w:w="80"/>
+            </w:tcMar>
+          </w:tcPr>
+          <w:p>
+            <w:pPr>
+              <w:spacing w:after="0" w:line="240"/>
+              <w:jc w:val="center"/>
+            </w:pPr>
+            <w:r>
+              <w:rPr>
+                <w:rFonts w:ascii="Calibri" w:cs="Calibri" w:eastAsia="Calibri" w:hAnsi="Calibri"/>
+                <w:sz w:val="17"/>
+                <w:szCs w:val="17"/>
+              </w:rPr>
+              <w:t xml:space="preserve">P37, P16</w:t>
+            </w:r>
+          </w:p>
+        </w:tc>
+        <w:tc>
+          <w:tcPr>
+            <w:tcW w:type="dxa" w:w="4300"/>
+            <w:tcMar>
+              <w:top w:type="dxa" w:w="40"/>
+              <w:left w:type="dxa" w:w="80"/>
+              <w:bottom w:type="dxa" w:w="40"/>
+              <w:right w:type="dxa" w:w="80"/>
+            </w:tcMar>
+          </w:tcPr>
+          <w:p>
+            <w:pPr>
+              <w:spacing w:after="0" w:line="240"/>
+            </w:pPr>
+            <w:r>
+              <w:rPr>
+                <w:rFonts w:ascii="Calibri" w:cs="Calibri" w:eastAsia="Calibri" w:hAnsi="Calibri"/>
+                <w:sz w:val="17"/>
+                <w:szCs w:val="17"/>
+              </w:rPr>
+              <w:t xml:space="preserve">(Coût à terminaison estimé − coût du budget initial) / coût du budget initial × 100.</w:t>
+            </w:r>
+          </w:p>
+        </w:tc>
+        <w:tc>
+          <w:tcPr>
+            <w:tcW w:type="dxa" w:w="2600"/>
+            <w:tcMar>
+              <w:top w:type="dxa" w:w="40"/>
+              <w:left w:type="dxa" w:w="80"/>
+              <w:bottom w:type="dxa" w:w="40"/>
+              <w:right w:type="dxa" w:w="80"/>
+            </w:tcMar>
+          </w:tcPr>
+          <w:p>
+            <w:pPr>
+              <w:spacing w:after="0" w:line="240"/>
+            </w:pPr>
+            <w:r>
+              <w:rPr>
+                <w:rFonts w:ascii="Calibri" w:cs="Calibri" w:eastAsia="Calibri" w:hAnsi="Calibri"/>
+                <w:sz w:val="15"/>
+                <w:szCs w:val="15"/>
+              </w:rPr>
+              <w:t xml:space="preserve">&lt; 5 % → 10 · 5 à &lt; 10 % → 6 · ≥ 10 % → 1</w:t>
+            </w:r>
+          </w:p>
+        </w:tc>
+        <w:tc>
+          <w:tcPr>
+            <w:tcW w:type="dxa" w:w="3800"/>
+            <w:tcMar>
+              <w:top w:type="dxa" w:w="40"/>
+              <w:left w:type="dxa" w:w="80"/>
+              <w:bottom w:type="dxa" w:w="40"/>
+              <w:right w:type="dxa" w:w="80"/>
+            </w:tcMar>
+          </w:tcPr>
+          <w:p>
+            <w:pPr>
+              <w:spacing w:after="0" w:line="240"/>
+            </w:pPr>
+            <w:r>
+              <w:rPr>
+                <w:rFonts w:ascii="Calibri" w:cs="Calibri" w:eastAsia="Calibri" w:hAnsi="Calibri"/>
+                <w:sz w:val="17"/>
+                <w:szCs w:val="17"/>
+              </w:rPr>
+              <w:t xml:space="preserve">Comparer au budget initial validé, pas à un budget révisé. Un dépassement non financé crée une impasse.</w:t>
+            </w:r>
+          </w:p>
+        </w:tc>
+      </w:tr>
     </w:tbl>
     <w:p>
       <w:pPr>
@@ -13830,7 +15825,7 @@
                 <w:sz w:val="17"/>
                 <w:szCs w:val="17"/>
               </w:rPr>
-              <w:t xml:space="preserve">Limite de division des risques dépassée</w:t>
+              <w:t xml:space="preserve">Composante commerciale / hôtelière sans preneur engagé</w:t>
             </w:r>
             <w:r>
               <w:rPr>
@@ -13839,7 +15834,7 @@
                 <w:sz w:val="14"/>
                 <w:szCs w:val="14"/>
               </w:rPr>
-              <w:t xml:space="preserve">  division_limit_breach</w:t>
+              <w:t xml:space="preserve">  component_exit_unsecured</w:t>
             </w:r>
             <w:r>
               <w:rPr>
@@ -13851,7 +15846,7 @@
                 <w:szCs w:val="14"/>
               </w:rPr>
               <w:br/>
-              <w:t xml:space="preserve">  Étape : Pratique marocaine (modèle v4)</w:t>
+              <w:t xml:space="preserve">  Étape : Programme, tranche, équipements et déblocages (modèle v5)</w:t>
             </w:r>
           </w:p>
         </w:tc>
@@ -13876,7 +15871,7 @@
                 <w:sz w:val="17"/>
                 <w:szCs w:val="17"/>
               </w:rPr>
-              <w:t xml:space="preserve">P03, P06</w:t>
+              <w:t xml:space="preserve">P38</w:t>
             </w:r>
           </w:p>
         </w:tc>
@@ -13900,7 +15895,7 @@
                 <w:sz w:val="17"/>
                 <w:szCs w:val="17"/>
               </w:rPr>
-              <w:t xml:space="preserve">Calculé par la synchronisation sur l'exposition du groupe d'intérêt, rapportée aux fonds propres paramétrés par la Direction des risques.</w:t>
+              <w:t xml:space="preserve">Oui si une composante significative (hôtel, commerces, bureaux) n'a ni acquéreur, ni opérateur, ni preneur engagé.</w:t>
             </w:r>
           </w:p>
         </w:tc>
@@ -13924,7 +15919,7 @@
                 <w:sz w:val="15"/>
                 <w:szCs w:val="15"/>
               </w:rPr>
-              <w:t xml:space="preserve">Limite de division des risques dépassée — malus 0 · retour en comité</w:t>
+              <w:t xml:space="preserve">Composante commerciale ou hôtelière sans preneur engagé — malus 10</w:t>
             </w:r>
           </w:p>
         </w:tc>
@@ -13948,7 +15943,7 @@
                 <w:sz w:val="17"/>
                 <w:szCs w:val="17"/>
               </w:rPr>
-              <w:t xml:space="preserve">Aucun malus : dépassement = décision au niveau de délégation requis (retour en comité). Déclarer tous les liens du groupe.</w:t>
+              <w:t xml:space="preserve">À apprécier par le chargé d'affaires au vu des engagements écrits, pas des intentions.</w:t>
             </w:r>
           </w:p>
         </w:tc>
@@ -13980,7 +15975,7 @@
                 <w:sz w:val="17"/>
                 <w:szCs w:val="17"/>
               </w:rPr>
-              <w:t xml:space="preserve">Fonds propres négatifs</w:t>
+              <w:t xml:space="preserve">Limite de division des risques dépassée</w:t>
             </w:r>
             <w:r>
               <w:rPr>
@@ -13989,7 +15984,7 @@
                 <w:sz w:val="14"/>
                 <w:szCs w:val="14"/>
               </w:rPr>
-              <w:t xml:space="preserve">  equity_negative</w:t>
+              <w:t xml:space="preserve">  division_limit_breach</w:t>
             </w:r>
             <w:r>
               <w:rPr>
@@ -14001,7 +15996,7 @@
                 <w:szCs w:val="14"/>
               </w:rPr>
               <w:br/>
-              <w:t xml:space="preserve">  Étape : Structuration financière &amp; LGD</w:t>
+              <w:t xml:space="preserve">  Étape : Pratique marocaine (modèle v4)</w:t>
             </w:r>
           </w:p>
         </w:tc>
@@ -14027,7 +16022,7 @@
                 <w:sz w:val="17"/>
                 <w:szCs w:val="17"/>
               </w:rPr>
-              <w:t xml:space="preserve">P04</w:t>
+              <w:t xml:space="preserve">P03, P06</w:t>
             </w:r>
           </w:p>
         </w:tc>
@@ -14052,7 +16047,7 @@
                 <w:sz w:val="17"/>
                 <w:szCs w:val="17"/>
               </w:rPr>
-              <w:t xml:space="preserve">Oui si les capitaux propres du dernier bilan sont négatifs.</w:t>
+              <w:t xml:space="preserve">Calculé par la synchronisation sur l'exposition du groupe d'intérêt, rapportée aux fonds propres paramétrés par la Direction des risques.</w:t>
             </w:r>
           </w:p>
         </w:tc>
@@ -14077,7 +16072,7 @@
                 <w:sz w:val="15"/>
                 <w:szCs w:val="15"/>
               </w:rPr>
-              <w:t xml:space="preserve">Fonds propres négatifs — malus 25</w:t>
+              <w:t xml:space="preserve">Limite de division des risques dépassée — malus 0 · retour en comité</w:t>
             </w:r>
           </w:p>
         </w:tc>
@@ -14102,7 +16097,7 @@
                 <w:sz w:val="17"/>
                 <w:szCs w:val="17"/>
               </w:rPr>
-              <w:t xml:space="preserve">Malus de 25 points ; vérifier les capitaux propres consolidés si le groupe soutient la société.</w:t>
+              <w:t xml:space="preserve">Aucun malus : dépassement = décision au niveau de délégation requis (retour en comité). Déclarer tous les liens du groupe.</w:t>
             </w:r>
           </w:p>
         </w:tc>
@@ -14133,7 +16128,7 @@
                 <w:sz w:val="17"/>
                 <w:szCs w:val="17"/>
               </w:rPr>
-              <w:t xml:space="preserve">Impasse persistante</w:t>
+              <w:t xml:space="preserve">Équipement exigé en retard (conditionne la réception)</w:t>
             </w:r>
             <w:r>
               <w:rPr>
@@ -14142,7 +16137,7 @@
                 <w:sz w:val="14"/>
                 <w:szCs w:val="14"/>
               </w:rPr>
-              <w:t xml:space="preserve">  funding_gap_persistent</w:t>
+              <w:t xml:space="preserve">  equipment_delivery_at_risk</w:t>
             </w:r>
             <w:r>
               <w:rPr>
@@ -14154,7 +16149,7 @@
                 <w:szCs w:val="14"/>
               </w:rPr>
               <w:br/>
-              <w:t xml:space="preserve">  Étape : Commercialisation &amp; Cash-flow</w:t>
+              <w:t xml:space="preserve">  Étape : Programme, tranche, équipements et déblocages (modèle v5)</w:t>
             </w:r>
           </w:p>
         </w:tc>
@@ -14179,7 +16174,7 @@
                 <w:sz w:val="17"/>
                 <w:szCs w:val="17"/>
               </w:rPr>
-              <w:t xml:space="preserve">P17</w:t>
+              <w:t xml:space="preserve">P35, P21</w:t>
             </w:r>
           </w:p>
         </w:tc>
@@ -14203,7 +16198,7 @@
                 <w:sz w:val="17"/>
                 <w:szCs w:val="17"/>
               </w:rPr>
-              <w:t xml:space="preserve">Oui si le plan de trésorerie montre une rupture sur au moins deux mois consécutifs.</w:t>
+              <w:t xml:space="preserve">Calculé par la synchronisation : un équipement conditionnant la réception est en retard (échéance dépassée ou retard de plus de 30 points sur le programme).</w:t>
             </w:r>
           </w:p>
         </w:tc>
@@ -14227,7 +16222,7 @@
                 <w:sz w:val="15"/>
                 <w:szCs w:val="15"/>
               </w:rPr>
-              <w:t xml:space="preserve">Impasse de trésorerie persistante — malus 20</w:t>
+              <w:t xml:space="preserve">Équipement exigé en retard (conditionne la réception) — malus 15 · retour en comité</w:t>
             </w:r>
           </w:p>
         </w:tc>
@@ -14251,7 +16246,7 @@
                 <w:sz w:val="17"/>
                 <w:szCs w:val="17"/>
               </w:rPr>
-              <w:t xml:space="preserve">Malus de 20 points.</w:t>
+              <w:t xml:space="preserve">Retour en comité : sans réception, pas de permis d'habiter, pas d'actes, pas de mainlevées.</w:t>
             </w:r>
           </w:p>
         </w:tc>
@@ -14280,21 +16275,10 @@
                 <w:rFonts w:ascii="Calibri" w:cs="Calibri" w:eastAsia="Calibri" w:hAnsi="Calibri"/>
                 <w:b/>
                 <w:bCs/>
-                <w:color w:val="C00000"/>
-                <w:sz w:val="17"/>
-                <w:szCs w:val="17"/>
-              </w:rPr>
-              <w:t xml:space="preserve">★ </w:t>
-            </w:r>
-            <w:r>
-              <w:rPr>
-                <w:rFonts w:ascii="Calibri" w:cs="Calibri" w:eastAsia="Calibri" w:hAnsi="Calibri"/>
-                <w:b/>
-                <w:bCs/>
-                <w:sz w:val="17"/>
-                <w:szCs w:val="17"/>
-              </w:rPr>
-              <w:t xml:space="preserve">Retard de paiement (jours)</w:t>
+                <w:sz w:val="17"/>
+                <w:szCs w:val="17"/>
+              </w:rPr>
+              <w:t xml:space="preserve">Fonds propres négatifs</w:t>
             </w:r>
             <w:r>
               <w:rPr>
@@ -14303,7 +16287,7 @@
                 <w:sz w:val="14"/>
                 <w:szCs w:val="14"/>
               </w:rPr>
-              <w:t xml:space="preserve">  dpd_days</w:t>
+              <w:t xml:space="preserve">  equity_negative</w:t>
             </w:r>
             <w:r>
               <w:rPr>
@@ -14315,7 +16299,7 @@
                 <w:szCs w:val="14"/>
               </w:rPr>
               <w:br/>
-              <w:t xml:space="preserve">  Étape : Vulnérabilité réglementaire BAM</w:t>
+              <w:t xml:space="preserve">  Étape : Structuration financière &amp; LGD</w:t>
             </w:r>
           </w:p>
         </w:tc>
@@ -14341,7 +16325,7 @@
                 <w:sz w:val="17"/>
                 <w:szCs w:val="17"/>
               </w:rPr>
-              <w:t xml:space="preserve">P31</w:t>
+              <w:t xml:space="preserve">P04</w:t>
             </w:r>
           </w:p>
         </w:tc>
@@ -14366,7 +16350,7 @@
                 <w:sz w:val="17"/>
                 <w:szCs w:val="17"/>
               </w:rPr>
-              <w:t xml:space="preserve">Jours de retard de la plus ancienne échéance impayée. Dérivé de l'échéancier des facilités par la synchronisation.</w:t>
+              <w:t xml:space="preserve">Oui si les capitaux propres du dernier bilan sont négatifs.</w:t>
             </w:r>
           </w:p>
         </w:tc>
@@ -14391,7 +16375,7 @@
                 <w:sz w:val="15"/>
                 <w:szCs w:val="15"/>
               </w:rPr>
-              <w:t xml:space="preserve">Impayé ≥ 90 jours (souffrance automatique) — bloquante (souffrance)</w:t>
+              <w:t xml:space="preserve">Fonds propres négatifs — malus 25</w:t>
             </w:r>
           </w:p>
         </w:tc>
@@ -14413,11 +16397,10 @@
             <w:r>
               <w:rPr>
                 <w:rFonts w:ascii="Calibri" w:cs="Calibri" w:eastAsia="Calibri" w:hAnsi="Calibri"/>
-                <w:color w:val="C00000"/>
-                <w:sz w:val="17"/>
-                <w:szCs w:val="17"/>
-              </w:rPr>
-              <w:t xml:space="preserve">DONNÉE DÉCISIONNELLE : saisir 0 s'il n'y a aucun impayé (et non laisser vide). ≥ 90 jours : souffrance automatique.</w:t>
+                <w:sz w:val="17"/>
+                <w:szCs w:val="17"/>
+              </w:rPr>
+              <w:t xml:space="preserve">Malus de 25 points ; vérifier les capitaux propres consolidés si le groupe soutient la société.</w:t>
             </w:r>
           </w:p>
         </w:tc>
@@ -14448,7 +16431,7 @@
                 <w:sz w:val="17"/>
                 <w:szCs w:val="17"/>
               </w:rPr>
-              <w:t xml:space="preserve">Exposition contentieuse</w:t>
+              <w:t xml:space="preserve">Impasse persistante</w:t>
             </w:r>
             <w:r>
               <w:rPr>
@@ -14457,7 +16440,7 @@
                 <w:sz w:val="14"/>
                 <w:szCs w:val="14"/>
               </w:rPr>
-              <w:t xml:space="preserve">  legal_exposure</w:t>
+              <w:t xml:space="preserve">  funding_gap_persistent</w:t>
             </w:r>
             <w:r>
               <w:rPr>
@@ -14469,7 +16452,7 @@
                 <w:szCs w:val="14"/>
               </w:rPr>
               <w:br/>
-              <w:t xml:space="preserve">  Étape : Vulnérabilité réglementaire BAM</w:t>
+              <w:t xml:space="preserve">  Étape : Commercialisation &amp; Cash-flow</w:t>
             </w:r>
           </w:p>
         </w:tc>
@@ -14494,7 +16477,7 @@
                 <w:sz w:val="17"/>
                 <w:szCs w:val="17"/>
               </w:rPr>
-              <w:t xml:space="preserve">P33, P25</w:t>
+              <w:t xml:space="preserve">P17</w:t>
             </w:r>
           </w:p>
         </w:tc>
@@ -14518,7 +16501,7 @@
                 <w:sz w:val="17"/>
                 <w:szCs w:val="17"/>
               </w:rPr>
-              <w:t xml:space="preserve">Contentieux : action en justice engagée. Surveillance : menace ou mise en demeure. Sain : aucune.</w:t>
+              <w:t xml:space="preserve">Oui si le plan de trésorerie montre une rupture sur au moins deux mois consécutifs.</w:t>
             </w:r>
           </w:p>
         </w:tc>
@@ -14542,7 +16525,7 @@
                 <w:sz w:val="15"/>
                 <w:szCs w:val="15"/>
               </w:rPr>
-              <w:t xml:space="preserve">Action en justice / contentieux (CTX) — bloquante (souffrance)</w:t>
+              <w:t xml:space="preserve">Impasse de trésorerie persistante — malus 20</w:t>
             </w:r>
           </w:p>
         </w:tc>
@@ -14566,7 +16549,7 @@
                 <w:sz w:val="17"/>
                 <w:szCs w:val="17"/>
               </w:rPr>
-              <w:t xml:space="preserve">Contentieux = alerte bloquante.</w:t>
+              <w:t xml:space="preserve">Malus de 20 points.</w:t>
             </w:r>
           </w:p>
         </w:tc>
@@ -14595,10 +16578,21 @@
                 <w:rFonts w:ascii="Calibri" w:cs="Calibri" w:eastAsia="Calibri" w:hAnsi="Calibri"/>
                 <w:b/>
                 <w:bCs/>
-                <w:sz w:val="17"/>
-                <w:szCs w:val="17"/>
-              </w:rPr>
-              <w:t xml:space="preserve">Prix de mainlevée sous-tarifé</w:t>
+                <w:color w:val="C00000"/>
+                <w:sz w:val="17"/>
+                <w:szCs w:val="17"/>
+              </w:rPr>
+              <w:t xml:space="preserve">★ </w:t>
+            </w:r>
+            <w:r>
+              <w:rPr>
+                <w:rFonts w:ascii="Calibri" w:cs="Calibri" w:eastAsia="Calibri" w:hAnsi="Calibri"/>
+                <w:b/>
+                <w:bCs/>
+                <w:sz w:val="17"/>
+                <w:szCs w:val="17"/>
+              </w:rPr>
+              <w:t xml:space="preserve">Retard de paiement (jours)</w:t>
             </w:r>
             <w:r>
               <w:rPr>
@@ -14607,7 +16601,7 @@
                 <w:sz w:val="14"/>
                 <w:szCs w:val="14"/>
               </w:rPr>
-              <w:t xml:space="preserve">  release_underpriced</w:t>
+              <w:t xml:space="preserve">  dpd_days</w:t>
             </w:r>
             <w:r>
               <w:rPr>
@@ -14619,7 +16613,7 @@
                 <w:szCs w:val="14"/>
               </w:rPr>
               <w:br/>
-              <w:t xml:space="preserve">  Étape : Pratique marocaine (modèle v4)</w:t>
+              <w:t xml:space="preserve">  Étape : Vulnérabilité réglementaire BAM</w:t>
             </w:r>
           </w:p>
         </w:tc>
@@ -14645,7 +16639,7 @@
                 <w:sz w:val="17"/>
                 <w:szCs w:val="17"/>
               </w:rPr>
-              <w:t xml:space="preserve">P29</w:t>
+              <w:t xml:space="preserve">P31</w:t>
             </w:r>
           </w:p>
         </w:tc>
@@ -14670,7 +16664,7 @@
                 <w:sz w:val="17"/>
                 <w:szCs w:val="17"/>
               </w:rPr>
-              <w:t xml:space="preserve">Calculé par la synchronisation : quotité convenue inférieure à la quotité d'équilibre.</w:t>
+              <w:t xml:space="preserve">Jours de retard de la plus ancienne échéance impayée. Dérivé de l'échéancier des facilités par la synchronisation.</w:t>
             </w:r>
           </w:p>
         </w:tc>
@@ -14695,7 +16689,7 @@
                 <w:sz w:val="15"/>
                 <w:szCs w:val="15"/>
               </w:rPr>
-              <w:t xml:space="preserve">Prix de mainlevée sous-tarifé — malus 15 · retour en comité</w:t>
+              <w:t xml:space="preserve">Impayé ≥ 90 jours (souffrance automatique) — bloquante (souffrance)</w:t>
             </w:r>
           </w:p>
         </w:tc>
@@ -14717,10 +16711,11 @@
             <w:r>
               <w:rPr>
                 <w:rFonts w:ascii="Calibri" w:cs="Calibri" w:eastAsia="Calibri" w:hAnsi="Calibri"/>
-                <w:sz w:val="17"/>
-                <w:szCs w:val="17"/>
-              </w:rPr>
-              <w:t xml:space="preserve">Retour en comité : proposer le relèvement de la quotité.</w:t>
+                <w:color w:val="C00000"/>
+                <w:sz w:val="17"/>
+                <w:szCs w:val="17"/>
+              </w:rPr>
+              <w:t xml:space="preserve">DONNÉE DÉCISIONNELLE : saisir 0 s'il n'y a aucun impayé (et non laisser vide). ≥ 90 jours : souffrance automatique.</w:t>
             </w:r>
           </w:p>
         </w:tc>
@@ -14748,21 +16743,10 @@
                 <w:rFonts w:ascii="Calibri" w:cs="Calibri" w:eastAsia="Calibri" w:hAnsi="Calibri"/>
                 <w:b/>
                 <w:bCs/>
-                <w:color w:val="C00000"/>
-                <w:sz w:val="17"/>
-                <w:szCs w:val="17"/>
-              </w:rPr>
-              <w:t xml:space="preserve">★ </w:t>
-            </w:r>
-            <w:r>
-              <w:rPr>
-                <w:rFonts w:ascii="Calibri" w:cs="Calibri" w:eastAsia="Calibri" w:hAnsi="Calibri"/>
-                <w:b/>
-                <w:bCs/>
-                <w:sz w:val="17"/>
-                <w:szCs w:val="17"/>
-              </w:rPr>
-              <w:t xml:space="preserve">Arrêt du projet (mois)</w:t>
+                <w:sz w:val="17"/>
+                <w:szCs w:val="17"/>
+              </w:rPr>
+              <w:t xml:space="preserve">Exposition contentieuse</w:t>
             </w:r>
             <w:r>
               <w:rPr>
@@ -14771,7 +16755,7 @@
                 <w:sz w:val="14"/>
                 <w:szCs w:val="14"/>
               </w:rPr>
-              <w:t xml:space="preserve">  project_stopped_months</w:t>
+              <w:t xml:space="preserve">  legal_exposure</w:t>
             </w:r>
             <w:r>
               <w:rPr>
@@ -14808,7 +16792,7 @@
                 <w:sz w:val="17"/>
                 <w:szCs w:val="17"/>
               </w:rPr>
-              <w:t xml:space="preserve">P21</w:t>
+              <w:t xml:space="preserve">P33, P25</w:t>
             </w:r>
           </w:p>
         </w:tc>
@@ -14832,7 +16816,7 @@
                 <w:sz w:val="17"/>
                 <w:szCs w:val="17"/>
               </w:rPr>
-              <w:t xml:space="preserve">Durée de l'arrêt de chantier en cours, en mois. Dérivée du journal (événement « Arrêt de chantier » ouvert) par la synchronisation.</w:t>
+              <w:t xml:space="preserve">Contentieux : action en justice engagée. Surveillance : menace ou mise en demeure. Sain : aucune.</w:t>
             </w:r>
           </w:p>
         </w:tc>
@@ -14856,7 +16840,7 @@
                 <w:sz w:val="15"/>
                 <w:szCs w:val="15"/>
               </w:rPr>
-              <w:t xml:space="preserve">Projet à l'arrêt ≥ 12 mois (souffrance automatique) — bloquante (souffrance)</w:t>
+              <w:t xml:space="preserve">Action en justice / contentieux (CTX) — bloquante (souffrance)</w:t>
             </w:r>
           </w:p>
         </w:tc>
@@ -14877,11 +16861,10 @@
             <w:r>
               <w:rPr>
                 <w:rFonts w:ascii="Calibri" w:cs="Calibri" w:eastAsia="Calibri" w:hAnsi="Calibri"/>
-                <w:color w:val="C00000"/>
-                <w:sz w:val="17"/>
-                <w:szCs w:val="17"/>
-              </w:rPr>
-              <w:t xml:space="preserve">DONNÉE DÉCISIONNELLE et alerte bloquante (≥ 12 mois : souffrance automatique). Saisir 0 si le chantier n'est pas arrêté — vide rend le dossier incomplet.</w:t>
+                <w:sz w:val="17"/>
+                <w:szCs w:val="17"/>
+              </w:rPr>
+              <w:t xml:space="preserve">Contentieux = alerte bloquante.</w:t>
             </w:r>
           </w:p>
         </w:tc>
@@ -14913,7 +16896,7 @@
                 <w:sz w:val="17"/>
                 <w:szCs w:val="17"/>
               </w:rPr>
-              <w:t xml:space="preserve">Restructuré</w:t>
+              <w:t xml:space="preserve">Prix de mainlevée sous-tarifé</w:t>
             </w:r>
             <w:r>
               <w:rPr>
@@ -14922,7 +16905,7 @@
                 <w:sz w:val="14"/>
                 <w:szCs w:val="14"/>
               </w:rPr>
-              <w:t xml:space="preserve">  restructured</w:t>
+              <w:t xml:space="preserve">  release_underpriced</w:t>
             </w:r>
             <w:r>
               <w:rPr>
@@ -14934,7 +16917,7 @@
                 <w:szCs w:val="14"/>
               </w:rPr>
               <w:br/>
-              <w:t xml:space="preserve">  Étape : Vulnérabilité réglementaire BAM</w:t>
+              <w:t xml:space="preserve">  Étape : Pratique marocaine (modèle v4)</w:t>
             </w:r>
           </w:p>
         </w:tc>
@@ -14960,7 +16943,7 @@
                 <w:sz w:val="17"/>
                 <w:szCs w:val="17"/>
               </w:rPr>
-              <w:t xml:space="preserve">P32</w:t>
+              <w:t xml:space="preserve">P29</w:t>
             </w:r>
           </w:p>
         </w:tc>
@@ -14985,7 +16968,7 @@
                 <w:sz w:val="17"/>
                 <w:szCs w:val="17"/>
               </w:rPr>
-              <w:t xml:space="preserve">Oui si la créance a fait l'objet d'une restructuration (avenant modifiant échéances ou conditions en raison de difficultés).</w:t>
+              <w:t xml:space="preserve">Calculé par la synchronisation : quotité convenue inférieure à la quotité d'équilibre.</w:t>
             </w:r>
           </w:p>
         </w:tc>
@@ -15010,7 +16993,7 @@
                 <w:sz w:val="15"/>
                 <w:szCs w:val="15"/>
               </w:rPr>
-              <w:t xml:space="preserve">Première restructuration — malus 25 · retour en comité</w:t>
+              <w:t xml:space="preserve">Prix de mainlevée sous-tarifé — malus 15 · retour en comité</w:t>
             </w:r>
           </w:p>
         </w:tc>
@@ -15035,7 +17018,7 @@
                 <w:sz w:val="17"/>
                 <w:szCs w:val="17"/>
               </w:rPr>
-              <w:t xml:space="preserve">Toute restructuration impose un retour en comité ; enregistrer aussi l'événement au journal.</w:t>
+              <w:t xml:space="preserve">Retour en comité : proposer le relèvement de la quotité.</w:t>
             </w:r>
           </w:p>
         </w:tc>
@@ -15063,21 +17046,10 @@
                 <w:rFonts w:ascii="Calibri" w:cs="Calibri" w:eastAsia="Calibri" w:hAnsi="Calibri"/>
                 <w:b/>
                 <w:bCs/>
-                <w:color w:val="C00000"/>
-                <w:sz w:val="17"/>
-                <w:szCs w:val="17"/>
-              </w:rPr>
-              <w:t xml:space="preserve">★ </w:t>
-            </w:r>
-            <w:r>
-              <w:rPr>
-                <w:rFonts w:ascii="Calibri" w:cs="Calibri" w:eastAsia="Calibri" w:hAnsi="Calibri"/>
-                <w:b/>
-                <w:bCs/>
-                <w:sz w:val="17"/>
-                <w:szCs w:val="17"/>
-              </w:rPr>
-              <w:t xml:space="preserve">Retard chantier (mois)</w:t>
+                <w:sz w:val="17"/>
+                <w:szCs w:val="17"/>
+              </w:rPr>
+              <w:t xml:space="preserve">Plan de tirage en retard</w:t>
             </w:r>
             <w:r>
               <w:rPr>
@@ -15086,7 +17058,7 @@
                 <w:sz w:val="14"/>
                 <w:szCs w:val="14"/>
               </w:rPr>
-              <w:t xml:space="preserve">  construction_delay_months</w:t>
+              <w:t xml:space="preserve">  drawdown_schedule_late</w:t>
             </w:r>
             <w:r>
               <w:rPr>
@@ -15098,7 +17070,7 @@
                 <w:szCs w:val="14"/>
               </w:rPr>
               <w:br/>
-              <w:t xml:space="preserve">  Étape : Vulnérabilité réglementaire BAM</w:t>
+              <w:t xml:space="preserve">  Étape : Programme, tranche, équipements et déblocages (modèle v5)</w:t>
             </w:r>
           </w:p>
         </w:tc>
@@ -15123,7 +17095,7 @@
                 <w:sz w:val="17"/>
                 <w:szCs w:val="17"/>
               </w:rPr>
-              <w:t xml:space="preserve">P20, P21</w:t>
+              <w:t xml:space="preserve">P26, P21</w:t>
             </w:r>
           </w:p>
         </w:tc>
@@ -15147,7 +17119,7 @@
                 <w:sz w:val="17"/>
                 <w:szCs w:val="17"/>
               </w:rPr>
-              <w:t xml:space="preserve">Retard de la date d'achèvement prévue par rapport au planning contractuel, en mois.</w:t>
+              <w:t xml:space="preserve">Calculé par la synchronisation sur le planning des déblocages : Oui si au moins 25 % du montant prévu à date n'est pas débloqué.</w:t>
             </w:r>
           </w:p>
         </w:tc>
@@ -15171,6 +17143,485 @@
                 <w:sz w:val="15"/>
                 <w:szCs w:val="15"/>
               </w:rPr>
+              <w:t xml:space="preserve">Plan de tirage en retard sur le calendrier — malus 5</w:t>
+            </w:r>
+          </w:p>
+        </w:tc>
+        <w:tc>
+          <w:tcPr>
+            <w:tcW w:type="dxa" w:w="3800"/>
+            <w:tcMar>
+              <w:top w:type="dxa" w:w="40"/>
+              <w:left w:type="dxa" w:w="80"/>
+              <w:bottom w:type="dxa" w:w="40"/>
+              <w:right w:type="dxa" w:w="80"/>
+            </w:tcMar>
+          </w:tcPr>
+          <w:p>
+            <w:pPr>
+              <w:spacing w:after="0" w:line="240"/>
+            </w:pPr>
+            <w:r>
+              <w:rPr>
+                <w:rFonts w:ascii="Calibri" w:cs="Calibri" w:eastAsia="Calibri" w:hAnsi="Calibri"/>
+                <w:sz w:val="17"/>
+                <w:szCs w:val="17"/>
+              </w:rPr>
+              <w:t xml:space="preserve">Signe d'un chantier en retard ou d'un besoin mal calibré : programmer une visite.</w:t>
+            </w:r>
+          </w:p>
+        </w:tc>
+      </w:tr>
+      <w:tr>
+        <w:trPr>
+          <w:cantSplit/>
+        </w:trPr>
+        <w:tc>
+          <w:tcPr>
+            <w:tcW w:type="dxa" w:w="2600"/>
+            <w:shd w:fill="F2F5FB" w:color="auto" w:val="clear"/>
+            <w:tcMar>
+              <w:top w:type="dxa" w:w="40"/>
+              <w:left w:type="dxa" w:w="80"/>
+              <w:bottom w:type="dxa" w:w="40"/>
+              <w:right w:type="dxa" w:w="80"/>
+            </w:tcMar>
+          </w:tcPr>
+          <w:p>
+            <w:pPr>
+              <w:spacing w:after="0" w:line="240"/>
+            </w:pPr>
+            <w:r>
+              <w:rPr>
+                <w:rFonts w:ascii="Calibri" w:cs="Calibri" w:eastAsia="Calibri" w:hAnsi="Calibri"/>
+                <w:b/>
+                <w:bCs/>
+                <w:color w:val="C00000"/>
+                <w:sz w:val="17"/>
+                <w:szCs w:val="17"/>
+              </w:rPr>
+              <w:t xml:space="preserve">★ </w:t>
+            </w:r>
+            <w:r>
+              <w:rPr>
+                <w:rFonts w:ascii="Calibri" w:cs="Calibri" w:eastAsia="Calibri" w:hAnsi="Calibri"/>
+                <w:b/>
+                <w:bCs/>
+                <w:sz w:val="17"/>
+                <w:szCs w:val="17"/>
+              </w:rPr>
+              <w:t xml:space="preserve">Arrêt du projet (mois)</w:t>
+            </w:r>
+            <w:r>
+              <w:rPr>
+                <w:rFonts w:ascii="Calibri" w:cs="Calibri" w:eastAsia="Calibri" w:hAnsi="Calibri"/>
+                <w:color w:val="595959"/>
+                <w:sz w:val="14"/>
+                <w:szCs w:val="14"/>
+              </w:rPr>
+              <w:t xml:space="preserve">  project_stopped_months</w:t>
+            </w:r>
+            <w:r>
+              <w:rPr>
+                <w:rFonts w:ascii="Calibri" w:cs="Calibri" w:eastAsia="Calibri" w:hAnsi="Calibri"/>
+                <w:i/>
+                <w:iCs/>
+                <w:color w:val="595959"/>
+                <w:sz w:val="14"/>
+                <w:szCs w:val="14"/>
+              </w:rPr>
+              <w:br/>
+              <w:t xml:space="preserve">  Étape : Vulnérabilité réglementaire BAM</w:t>
+            </w:r>
+          </w:p>
+        </w:tc>
+        <w:tc>
+          <w:tcPr>
+            <w:tcW w:type="dxa" w:w="1100"/>
+            <w:shd w:fill="F2F5FB" w:color="auto" w:val="clear"/>
+            <w:tcMar>
+              <w:top w:type="dxa" w:w="40"/>
+              <w:left w:type="dxa" w:w="80"/>
+              <w:bottom w:type="dxa" w:w="40"/>
+              <w:right w:type="dxa" w:w="80"/>
+            </w:tcMar>
+          </w:tcPr>
+          <w:p>
+            <w:pPr>
+              <w:spacing w:after="0" w:line="240"/>
+              <w:jc w:val="center"/>
+            </w:pPr>
+            <w:r>
+              <w:rPr>
+                <w:rFonts w:ascii="Calibri" w:cs="Calibri" w:eastAsia="Calibri" w:hAnsi="Calibri"/>
+                <w:sz w:val="17"/>
+                <w:szCs w:val="17"/>
+              </w:rPr>
+              <w:t xml:space="preserve">P21</w:t>
+            </w:r>
+          </w:p>
+        </w:tc>
+        <w:tc>
+          <w:tcPr>
+            <w:tcW w:type="dxa" w:w="4300"/>
+            <w:shd w:fill="F2F5FB" w:color="auto" w:val="clear"/>
+            <w:tcMar>
+              <w:top w:type="dxa" w:w="40"/>
+              <w:left w:type="dxa" w:w="80"/>
+              <w:bottom w:type="dxa" w:w="40"/>
+              <w:right w:type="dxa" w:w="80"/>
+            </w:tcMar>
+          </w:tcPr>
+          <w:p>
+            <w:pPr>
+              <w:spacing w:after="0" w:line="240"/>
+            </w:pPr>
+            <w:r>
+              <w:rPr>
+                <w:rFonts w:ascii="Calibri" w:cs="Calibri" w:eastAsia="Calibri" w:hAnsi="Calibri"/>
+                <w:sz w:val="17"/>
+                <w:szCs w:val="17"/>
+              </w:rPr>
+              <w:t xml:space="preserve">Durée de l'arrêt de chantier en cours, en mois. Dérivée du journal (événement « Arrêt de chantier » ouvert) par la synchronisation.</w:t>
+            </w:r>
+          </w:p>
+        </w:tc>
+        <w:tc>
+          <w:tcPr>
+            <w:tcW w:type="dxa" w:w="2600"/>
+            <w:shd w:fill="F2F5FB" w:color="auto" w:val="clear"/>
+            <w:tcMar>
+              <w:top w:type="dxa" w:w="40"/>
+              <w:left w:type="dxa" w:w="80"/>
+              <w:bottom w:type="dxa" w:w="40"/>
+              <w:right w:type="dxa" w:w="80"/>
+            </w:tcMar>
+          </w:tcPr>
+          <w:p>
+            <w:pPr>
+              <w:spacing w:after="0" w:line="240"/>
+            </w:pPr>
+            <w:r>
+              <w:rPr>
+                <w:rFonts w:ascii="Calibri" w:cs="Calibri" w:eastAsia="Calibri" w:hAnsi="Calibri"/>
+                <w:sz w:val="15"/>
+                <w:szCs w:val="15"/>
+              </w:rPr>
+              <w:t xml:space="preserve">Projet à l'arrêt ≥ 12 mois (souffrance automatique) — bloquante (souffrance)</w:t>
+            </w:r>
+          </w:p>
+        </w:tc>
+        <w:tc>
+          <w:tcPr>
+            <w:tcW w:type="dxa" w:w="3800"/>
+            <w:shd w:fill="F2F5FB" w:color="auto" w:val="clear"/>
+            <w:tcMar>
+              <w:top w:type="dxa" w:w="40"/>
+              <w:left w:type="dxa" w:w="80"/>
+              <w:bottom w:type="dxa" w:w="40"/>
+              <w:right w:type="dxa" w:w="80"/>
+            </w:tcMar>
+          </w:tcPr>
+          <w:p>
+            <w:pPr>
+              <w:spacing w:after="0" w:line="240"/>
+            </w:pPr>
+            <w:r>
+              <w:rPr>
+                <w:rFonts w:ascii="Calibri" w:cs="Calibri" w:eastAsia="Calibri" w:hAnsi="Calibri"/>
+                <w:color w:val="C00000"/>
+                <w:sz w:val="17"/>
+                <w:szCs w:val="17"/>
+              </w:rPr>
+              <w:t xml:space="preserve">DONNÉE DÉCISIONNELLE et alerte bloquante (≥ 12 mois : souffrance automatique). Saisir 0 si le chantier n'est pas arrêté — vide rend le dossier incomplet.</w:t>
+            </w:r>
+          </w:p>
+        </w:tc>
+      </w:tr>
+      <w:tr>
+        <w:trPr>
+          <w:cantSplit/>
+        </w:trPr>
+        <w:tc>
+          <w:tcPr>
+            <w:tcW w:type="dxa" w:w="2600"/>
+            <w:tcMar>
+              <w:top w:type="dxa" w:w="40"/>
+              <w:left w:type="dxa" w:w="80"/>
+              <w:bottom w:type="dxa" w:w="40"/>
+              <w:right w:type="dxa" w:w="80"/>
+            </w:tcMar>
+          </w:tcPr>
+          <w:p>
+            <w:pPr>
+              <w:spacing w:after="0" w:line="240"/>
+            </w:pPr>
+            <w:r>
+              <w:rPr>
+                <w:rFonts w:ascii="Calibri" w:cs="Calibri" w:eastAsia="Calibri" w:hAnsi="Calibri"/>
+                <w:b/>
+                <w:bCs/>
+                <w:sz w:val="17"/>
+                <w:szCs w:val="17"/>
+              </w:rPr>
+              <w:t xml:space="preserve">Restructuré</w:t>
+            </w:r>
+            <w:r>
+              <w:rPr>
+                <w:rFonts w:ascii="Calibri" w:cs="Calibri" w:eastAsia="Calibri" w:hAnsi="Calibri"/>
+                <w:color w:val="595959"/>
+                <w:sz w:val="14"/>
+                <w:szCs w:val="14"/>
+              </w:rPr>
+              <w:t xml:space="preserve">  restructured</w:t>
+            </w:r>
+            <w:r>
+              <w:rPr>
+                <w:rFonts w:ascii="Calibri" w:cs="Calibri" w:eastAsia="Calibri" w:hAnsi="Calibri"/>
+                <w:i/>
+                <w:iCs/>
+                <w:color w:val="595959"/>
+                <w:sz w:val="14"/>
+                <w:szCs w:val="14"/>
+              </w:rPr>
+              <w:br/>
+              <w:t xml:space="preserve">  Étape : Vulnérabilité réglementaire BAM</w:t>
+            </w:r>
+          </w:p>
+        </w:tc>
+        <w:tc>
+          <w:tcPr>
+            <w:tcW w:type="dxa" w:w="1100"/>
+            <w:tcMar>
+              <w:top w:type="dxa" w:w="40"/>
+              <w:left w:type="dxa" w:w="80"/>
+              <w:bottom w:type="dxa" w:w="40"/>
+              <w:right w:type="dxa" w:w="80"/>
+            </w:tcMar>
+          </w:tcPr>
+          <w:p>
+            <w:pPr>
+              <w:spacing w:after="0" w:line="240"/>
+              <w:jc w:val="center"/>
+            </w:pPr>
+            <w:r>
+              <w:rPr>
+                <w:rFonts w:ascii="Calibri" w:cs="Calibri" w:eastAsia="Calibri" w:hAnsi="Calibri"/>
+                <w:sz w:val="17"/>
+                <w:szCs w:val="17"/>
+              </w:rPr>
+              <w:t xml:space="preserve">P32</w:t>
+            </w:r>
+          </w:p>
+        </w:tc>
+        <w:tc>
+          <w:tcPr>
+            <w:tcW w:type="dxa" w:w="4300"/>
+            <w:tcMar>
+              <w:top w:type="dxa" w:w="40"/>
+              <w:left w:type="dxa" w:w="80"/>
+              <w:bottom w:type="dxa" w:w="40"/>
+              <w:right w:type="dxa" w:w="80"/>
+            </w:tcMar>
+          </w:tcPr>
+          <w:p>
+            <w:pPr>
+              <w:spacing w:after="0" w:line="240"/>
+            </w:pPr>
+            <w:r>
+              <w:rPr>
+                <w:rFonts w:ascii="Calibri" w:cs="Calibri" w:eastAsia="Calibri" w:hAnsi="Calibri"/>
+                <w:sz w:val="17"/>
+                <w:szCs w:val="17"/>
+              </w:rPr>
+              <w:t xml:space="preserve">Oui si la créance a fait l'objet d'une restructuration (avenant modifiant échéances ou conditions en raison de difficultés).</w:t>
+            </w:r>
+          </w:p>
+        </w:tc>
+        <w:tc>
+          <w:tcPr>
+            <w:tcW w:type="dxa" w:w="2600"/>
+            <w:tcMar>
+              <w:top w:type="dxa" w:w="40"/>
+              <w:left w:type="dxa" w:w="80"/>
+              <w:bottom w:type="dxa" w:w="40"/>
+              <w:right w:type="dxa" w:w="80"/>
+            </w:tcMar>
+          </w:tcPr>
+          <w:p>
+            <w:pPr>
+              <w:spacing w:after="0" w:line="240"/>
+            </w:pPr>
+            <w:r>
+              <w:rPr>
+                <w:rFonts w:ascii="Calibri" w:cs="Calibri" w:eastAsia="Calibri" w:hAnsi="Calibri"/>
+                <w:sz w:val="15"/>
+                <w:szCs w:val="15"/>
+              </w:rPr>
+              <w:t xml:space="preserve">Première restructuration — malus 25 · retour en comité</w:t>
+            </w:r>
+          </w:p>
+        </w:tc>
+        <w:tc>
+          <w:tcPr>
+            <w:tcW w:type="dxa" w:w="3800"/>
+            <w:tcMar>
+              <w:top w:type="dxa" w:w="40"/>
+              <w:left w:type="dxa" w:w="80"/>
+              <w:bottom w:type="dxa" w:w="40"/>
+              <w:right w:type="dxa" w:w="80"/>
+            </w:tcMar>
+          </w:tcPr>
+          <w:p>
+            <w:pPr>
+              <w:spacing w:after="0" w:line="240"/>
+            </w:pPr>
+            <w:r>
+              <w:rPr>
+                <w:rFonts w:ascii="Calibri" w:cs="Calibri" w:eastAsia="Calibri" w:hAnsi="Calibri"/>
+                <w:sz w:val="17"/>
+                <w:szCs w:val="17"/>
+              </w:rPr>
+              <w:t xml:space="preserve">Toute restructuration impose un retour en comité ; enregistrer aussi l'événement au journal.</w:t>
+            </w:r>
+          </w:p>
+        </w:tc>
+      </w:tr>
+      <w:tr>
+        <w:trPr>
+          <w:cantSplit/>
+        </w:trPr>
+        <w:tc>
+          <w:tcPr>
+            <w:tcW w:type="dxa" w:w="2600"/>
+            <w:shd w:fill="F2F5FB" w:color="auto" w:val="clear"/>
+            <w:tcMar>
+              <w:top w:type="dxa" w:w="40"/>
+              <w:left w:type="dxa" w:w="80"/>
+              <w:bottom w:type="dxa" w:w="40"/>
+              <w:right w:type="dxa" w:w="80"/>
+            </w:tcMar>
+          </w:tcPr>
+          <w:p>
+            <w:pPr>
+              <w:spacing w:after="0" w:line="240"/>
+            </w:pPr>
+            <w:r>
+              <w:rPr>
+                <w:rFonts w:ascii="Calibri" w:cs="Calibri" w:eastAsia="Calibri" w:hAnsi="Calibri"/>
+                <w:b/>
+                <w:bCs/>
+                <w:color w:val="C00000"/>
+                <w:sz w:val="17"/>
+                <w:szCs w:val="17"/>
+              </w:rPr>
+              <w:t xml:space="preserve">★ </w:t>
+            </w:r>
+            <w:r>
+              <w:rPr>
+                <w:rFonts w:ascii="Calibri" w:cs="Calibri" w:eastAsia="Calibri" w:hAnsi="Calibri"/>
+                <w:b/>
+                <w:bCs/>
+                <w:sz w:val="17"/>
+                <w:szCs w:val="17"/>
+              </w:rPr>
+              <w:t xml:space="preserve">Retard chantier (mois)</w:t>
+            </w:r>
+            <w:r>
+              <w:rPr>
+                <w:rFonts w:ascii="Calibri" w:cs="Calibri" w:eastAsia="Calibri" w:hAnsi="Calibri"/>
+                <w:color w:val="595959"/>
+                <w:sz w:val="14"/>
+                <w:szCs w:val="14"/>
+              </w:rPr>
+              <w:t xml:space="preserve">  construction_delay_months</w:t>
+            </w:r>
+            <w:r>
+              <w:rPr>
+                <w:rFonts w:ascii="Calibri" w:cs="Calibri" w:eastAsia="Calibri" w:hAnsi="Calibri"/>
+                <w:i/>
+                <w:iCs/>
+                <w:color w:val="595959"/>
+                <w:sz w:val="14"/>
+                <w:szCs w:val="14"/>
+              </w:rPr>
+              <w:br/>
+              <w:t xml:space="preserve">  Étape : Vulnérabilité réglementaire BAM</w:t>
+            </w:r>
+          </w:p>
+        </w:tc>
+        <w:tc>
+          <w:tcPr>
+            <w:tcW w:type="dxa" w:w="1100"/>
+            <w:shd w:fill="F2F5FB" w:color="auto" w:val="clear"/>
+            <w:tcMar>
+              <w:top w:type="dxa" w:w="40"/>
+              <w:left w:type="dxa" w:w="80"/>
+              <w:bottom w:type="dxa" w:w="40"/>
+              <w:right w:type="dxa" w:w="80"/>
+            </w:tcMar>
+          </w:tcPr>
+          <w:p>
+            <w:pPr>
+              <w:spacing w:after="0" w:line="240"/>
+              <w:jc w:val="center"/>
+            </w:pPr>
+            <w:r>
+              <w:rPr>
+                <w:rFonts w:ascii="Calibri" w:cs="Calibri" w:eastAsia="Calibri" w:hAnsi="Calibri"/>
+                <w:sz w:val="17"/>
+                <w:szCs w:val="17"/>
+              </w:rPr>
+              <w:t xml:space="preserve">P20, P21</w:t>
+            </w:r>
+          </w:p>
+        </w:tc>
+        <w:tc>
+          <w:tcPr>
+            <w:tcW w:type="dxa" w:w="4300"/>
+            <w:shd w:fill="F2F5FB" w:color="auto" w:val="clear"/>
+            <w:tcMar>
+              <w:top w:type="dxa" w:w="40"/>
+              <w:left w:type="dxa" w:w="80"/>
+              <w:bottom w:type="dxa" w:w="40"/>
+              <w:right w:type="dxa" w:w="80"/>
+            </w:tcMar>
+          </w:tcPr>
+          <w:p>
+            <w:pPr>
+              <w:spacing w:after="0" w:line="240"/>
+            </w:pPr>
+            <w:r>
+              <w:rPr>
+                <w:rFonts w:ascii="Calibri" w:cs="Calibri" w:eastAsia="Calibri" w:hAnsi="Calibri"/>
+                <w:sz w:val="17"/>
+                <w:szCs w:val="17"/>
+              </w:rPr>
+              <w:t xml:space="preserve">Retard de la date d'achèvement prévue par rapport au planning contractuel, en mois.</w:t>
+            </w:r>
+          </w:p>
+        </w:tc>
+        <w:tc>
+          <w:tcPr>
+            <w:tcW w:type="dxa" w:w="2600"/>
+            <w:shd w:fill="F2F5FB" w:color="auto" w:val="clear"/>
+            <w:tcMar>
+              <w:top w:type="dxa" w:w="40"/>
+              <w:left w:type="dxa" w:w="80"/>
+              <w:bottom w:type="dxa" w:w="40"/>
+              <w:right w:type="dxa" w:w="80"/>
+            </w:tcMar>
+          </w:tcPr>
+          <w:p>
+            <w:pPr>
+              <w:spacing w:after="0" w:line="240"/>
+            </w:pPr>
+            <w:r>
+              <w:rPr>
+                <w:rFonts w:ascii="Calibri" w:cs="Calibri" w:eastAsia="Calibri" w:hAnsi="Calibri"/>
+                <w:sz w:val="15"/>
+                <w:szCs w:val="15"/>
+              </w:rPr>
               <w:t xml:space="preserve">Retard chantier ≥ 6 mois — malus 15 · retour en comité</w:t>
             </w:r>
           </w:p>
@@ -15178,6 +17629,7 @@
         <w:tc>
           <w:tcPr>
             <w:tcW w:type="dxa" w:w="3800"/>
+            <w:shd w:fill="F2F5FB" w:color="auto" w:val="clear"/>
             <w:tcMar>
               <w:top w:type="dxa" w:w="40"/>
               <w:left w:type="dxa" w:w="80"/>
@@ -15197,6 +17649,155 @@
                 <w:szCs w:val="17"/>
               </w:rPr>
               <w:t xml:space="preserve">DONNÉE DÉCISIONNELLE et clé d'alerte (≥ 6 mois : malus 15 et retour en comité). Saisir 0 si aucun retard — vide rend le dossier incomplet.</w:t>
+            </w:r>
+          </w:p>
+        </w:tc>
+      </w:tr>
+      <w:tr>
+        <w:trPr>
+          <w:cantSplit/>
+        </w:trPr>
+        <w:tc>
+          <w:tcPr>
+            <w:tcW w:type="dxa" w:w="2600"/>
+            <w:tcMar>
+              <w:top w:type="dxa" w:w="40"/>
+              <w:left w:type="dxa" w:w="80"/>
+              <w:bottom w:type="dxa" w:w="40"/>
+              <w:right w:type="dxa" w:w="80"/>
+            </w:tcMar>
+          </w:tcPr>
+          <w:p>
+            <w:pPr>
+              <w:spacing w:after="0" w:line="240"/>
+            </w:pPr>
+            <w:r>
+              <w:rPr>
+                <w:rFonts w:ascii="Calibri" w:cs="Calibri" w:eastAsia="Calibri" w:hAnsi="Calibri"/>
+                <w:b/>
+                <w:bCs/>
+                <w:sz w:val="17"/>
+                <w:szCs w:val="17"/>
+              </w:rPr>
+              <w:t xml:space="preserve">Déblocages en avance sur les travaux</w:t>
+            </w:r>
+            <w:r>
+              <w:rPr>
+                <w:rFonts w:ascii="Calibri" w:cs="Calibri" w:eastAsia="Calibri" w:hAnsi="Calibri"/>
+                <w:color w:val="595959"/>
+                <w:sz w:val="14"/>
+                <w:szCs w:val="14"/>
+              </w:rPr>
+              <w:t xml:space="preserve">  drawdown_ahead_of_works</w:t>
+            </w:r>
+            <w:r>
+              <w:rPr>
+                <w:rFonts w:ascii="Calibri" w:cs="Calibri" w:eastAsia="Calibri" w:hAnsi="Calibri"/>
+                <w:i/>
+                <w:iCs/>
+                <w:color w:val="595959"/>
+                <w:sz w:val="14"/>
+                <w:szCs w:val="14"/>
+              </w:rPr>
+              <w:br/>
+              <w:t xml:space="preserve">  Étape : Programme, tranche, équipements et déblocages (modèle v5)</w:t>
+            </w:r>
+          </w:p>
+        </w:tc>
+        <w:tc>
+          <w:tcPr>
+            <w:tcW w:type="dxa" w:w="1100"/>
+            <w:tcMar>
+              <w:top w:type="dxa" w:w="40"/>
+              <w:left w:type="dxa" w:w="80"/>
+              <w:bottom w:type="dxa" w:w="40"/>
+              <w:right w:type="dxa" w:w="80"/>
+            </w:tcMar>
+          </w:tcPr>
+          <w:p>
+            <w:pPr>
+              <w:spacing w:after="0" w:line="240"/>
+              <w:jc w:val="center"/>
+            </w:pPr>
+            <w:r>
+              <w:rPr>
+                <w:rFonts w:ascii="Calibri" w:cs="Calibri" w:eastAsia="Calibri" w:hAnsi="Calibri"/>
+                <w:sz w:val="17"/>
+                <w:szCs w:val="17"/>
+              </w:rPr>
+              <w:t xml:space="preserve">P21</w:t>
+            </w:r>
+          </w:p>
+        </w:tc>
+        <w:tc>
+          <w:tcPr>
+            <w:tcW w:type="dxa" w:w="4300"/>
+            <w:tcMar>
+              <w:top w:type="dxa" w:w="40"/>
+              <w:left w:type="dxa" w:w="80"/>
+              <w:bottom w:type="dxa" w:w="40"/>
+              <w:right w:type="dxa" w:w="80"/>
+            </w:tcMar>
+          </w:tcPr>
+          <w:p>
+            <w:pPr>
+              <w:spacing w:after="0" w:line="240"/>
+            </w:pPr>
+            <w:r>
+              <w:rPr>
+                <w:rFonts w:ascii="Calibri" w:cs="Calibri" w:eastAsia="Calibri" w:hAnsi="Calibri"/>
+                <w:sz w:val="17"/>
+                <w:szCs w:val="17"/>
+              </w:rPr>
+              <w:t xml:space="preserve">Calculé par la synchronisation : Oui si les déblocages atteignent 115 % de l'avancement certifié.</w:t>
+            </w:r>
+          </w:p>
+        </w:tc>
+        <w:tc>
+          <w:tcPr>
+            <w:tcW w:type="dxa" w:w="2600"/>
+            <w:tcMar>
+              <w:top w:type="dxa" w:w="40"/>
+              <w:left w:type="dxa" w:w="80"/>
+              <w:bottom w:type="dxa" w:w="40"/>
+              <w:right w:type="dxa" w:w="80"/>
+            </w:tcMar>
+          </w:tcPr>
+          <w:p>
+            <w:pPr>
+              <w:spacing w:after="0" w:line="240"/>
+            </w:pPr>
+            <w:r>
+              <w:rPr>
+                <w:rFonts w:ascii="Calibri" w:cs="Calibri" w:eastAsia="Calibri" w:hAnsi="Calibri"/>
+                <w:sz w:val="15"/>
+                <w:szCs w:val="15"/>
+              </w:rPr>
+              <w:t xml:space="preserve">Déblocages en avance sur l'avancement des travaux — malus 15 · retour en comité</w:t>
+            </w:r>
+          </w:p>
+        </w:tc>
+        <w:tc>
+          <w:tcPr>
+            <w:tcW w:type="dxa" w:w="3800"/>
+            <w:tcMar>
+              <w:top w:type="dxa" w:w="40"/>
+              <w:left w:type="dxa" w:w="80"/>
+              <w:bottom w:type="dxa" w:w="40"/>
+              <w:right w:type="dxa" w:w="80"/>
+            </w:tcMar>
+          </w:tcPr>
+          <w:p>
+            <w:pPr>
+              <w:spacing w:after="0" w:line="240"/>
+            </w:pPr>
+            <w:r>
+              <w:rPr>
+                <w:rFonts w:ascii="Calibri" w:cs="Calibri" w:eastAsia="Calibri" w:hAnsi="Calibri"/>
+                <w:sz w:val="17"/>
+                <w:szCs w:val="17"/>
+              </w:rPr>
+              <w:t xml:space="preserve">Retour en comité : suspendre les tirages jusqu'à une situation visée cohérente.</w:t>
             </w:r>
           </w:p>
         </w:tc>
@@ -17568,6 +20169,185 @@
         <w:keepNext/>
       </w:pPr>
       <w:r>
+        <w:t xml:space="preserve">Programme, tranche financée, équipements (modèle v5)</w:t>
+      </w:r>
+    </w:p>
+    <w:p>
+      <w:pPr>
+        <w:spacing w:after="120" w:before="0" w:line="276"/>
+      </w:pPr>
+      <w:r>
+        <w:rPr>
+          <w:rFonts w:ascii="Calibri" w:cs="Calibri" w:eastAsia="Calibri" w:hAnsi="Calibri"/>
+          <w:sz w:val="21"/>
+          <w:szCs w:val="21"/>
+        </w:rPr>
+        <w:t xml:space="preserve">Fiche projet › Suivi › carte « Programme, tranche financée, équipements et déblocages ». Ce que la carte affiche est exactement ce que « Synchroniser vers le scoring » reporte dans le score.</w:t>
+      </w:r>
+    </w:p>
+    <w:p>
+      <w:pPr>
+        <w:pStyle w:val="ListParagraph"/>
+        <w:numPr>
+          <w:ilvl w:val="0"/>
+          <w:numId w:val="3"/>
+        </w:numPr>
+        <w:spacing w:after="60" w:line="276"/>
+      </w:pPr>
+      <w:r>
+        <w:rPr>
+          <w:rFonts w:ascii="Calibri" w:cs="Calibri" w:eastAsia="Calibri" w:hAnsi="Calibri"/>
+          <w:sz w:val="21"/>
+          <w:szCs w:val="21"/>
+        </w:rPr>
+        <w:t xml:space="preserve">Tranche financée : si la banque ne finance qu'une tranche (ou un lot), cochez-la, et rattachez chaque facilité à sa tranche. Les préventes, désistements, composition et encours sont alors calculés sur ce seul périmètre. Appréciez ensuite l'autonomie de la tranche (accès, VRD, raccordements).</w:t>
+      </w:r>
+    </w:p>
+    <w:p>
+      <w:pPr>
+        <w:pStyle w:val="ListParagraph"/>
+        <w:numPr>
+          <w:ilvl w:val="0"/>
+          <w:numId w:val="3"/>
+        </w:numPr>
+        <w:spacing w:after="60" w:line="276"/>
+      </w:pPr>
+      <w:r>
+        <w:rPr>
+          <w:rFonts w:ascii="Calibri" w:cs="Calibri" w:eastAsia="Calibri" w:hAnsi="Calibri"/>
+          <w:sz w:val="21"/>
+          <w:szCs w:val="21"/>
+        </w:rPr>
+        <w:t xml:space="preserve">Programme mixte : saisissez chaque lot avec son type exact (appartement, villa, commerce, bureau, hôtel). La part du chiffre d'affaires à écoulement lent (commerces, bureaux, hôtel) est calculée ; une composante sans preneur engagé se déclare comme alerte.</w:t>
+      </w:r>
+    </w:p>
+    <w:p>
+      <w:pPr>
+        <w:pStyle w:val="ListParagraph"/>
+        <w:numPr>
+          <w:ilvl w:val="0"/>
+          <w:numId w:val="3"/>
+        </w:numPr>
+        <w:spacing w:after="60" w:line="276"/>
+      </w:pPr>
+      <w:r>
+        <w:rPr>
+          <w:rFonts w:ascii="Calibri" w:cs="Calibri" w:eastAsia="Calibri" w:hAnsi="Calibri"/>
+          <w:sz w:val="21"/>
+          <w:szCs w:val="21"/>
+        </w:rPr>
+        <w:t xml:space="preserve">Équipements exigés : déclarez la mosquée, l'école, la voirie… exigées par la commune, le cahier des charges ou l'autorisation, avec coût, financeur, échéance et avancement. S'il n'y en a aucun, déclarez-le explicitement : non déclaré = note plancher.</w:t>
+      </w:r>
+    </w:p>
+    <w:p>
+      <w:pPr>
+        <w:pStyle w:val="ListParagraph"/>
+        <w:numPr>
+          <w:ilvl w:val="0"/>
+          <w:numId w:val="3"/>
+        </w:numPr>
+        <w:spacing w:after="60" w:line="276"/>
+      </w:pPr>
+      <w:r>
+        <w:rPr>
+          <w:rFonts w:ascii="Calibri" w:cs="Calibri" w:eastAsia="Calibri" w:hAnsi="Calibri"/>
+          <w:sz w:val="21"/>
+          <w:szCs w:val="21"/>
+        </w:rPr>
+        <w:t xml:space="preserve">Régionalité : la région administrative du projet et le référentiel « Marché régional » (tenu par la Direction des risques) donnent la tension du marché. Une appréciation de plus de 12 mois est signalée périmée.</w:t>
+      </w:r>
+    </w:p>
+    <w:p>
+      <w:pPr>
+        <w:pStyle w:val="Heading2"/>
+        <w:keepNext/>
+      </w:pPr>
+      <w:r>
+        <w:t xml:space="preserve">Suivi des déblocages selon le calendrier</w:t>
+      </w:r>
+    </w:p>
+    <w:p>
+      <w:pPr>
+        <w:pStyle w:val="ListParagraph"/>
+        <w:numPr>
+          <w:ilvl w:val="0"/>
+          <w:numId w:val="3"/>
+        </w:numPr>
+        <w:spacing w:after="60" w:line="276"/>
+      </w:pPr>
+      <w:r>
+        <w:rPr>
+          <w:rFonts w:ascii="Calibri" w:cs="Calibri" w:eastAsia="Calibri" w:hAnsi="Calibri"/>
+          <w:sz w:val="21"/>
+          <w:szCs w:val="21"/>
+        </w:rPr>
+        <w:t xml:space="preserve">Déblocages vs avancement : cumul débloqué / (autorisé × avancement certifié). À 115 % ou plus, l'alerte « tirages en avance » impose un retour en comité : suspendre les tirages jusqu'à une situation visée cohérente.</w:t>
+      </w:r>
+    </w:p>
+    <w:p>
+      <w:pPr>
+        <w:pStyle w:val="ListParagraph"/>
+        <w:numPr>
+          <w:ilvl w:val="0"/>
+          <w:numId w:val="3"/>
+        </w:numPr>
+        <w:spacing w:after="60" w:line="276"/>
+      </w:pPr>
+      <w:r>
+        <w:rPr>
+          <w:rFonts w:ascii="Calibri" w:cs="Calibri" w:eastAsia="Calibri" w:hAnsi="Calibri"/>
+          <w:sz w:val="21"/>
+          <w:szCs w:val="21"/>
+        </w:rPr>
+        <w:t xml:space="preserve">Plan de tirage : chaque déblocage réel est rattaché à son jalon du planning initial. Si 25 % ou plus du montant prévu à date n'est pas débloqué, l'alerte « plan de tirage en retard » se déclenche : programmer une visite.</w:t>
+      </w:r>
+    </w:p>
+    <w:p>
+      <w:pPr>
+        <w:pStyle w:val="ListParagraph"/>
+        <w:numPr>
+          <w:ilvl w:val="0"/>
+          <w:numId w:val="3"/>
+        </w:numPr>
+        <w:spacing w:after="60" w:line="276"/>
+      </w:pPr>
+      <w:r>
+        <w:rPr>
+          <w:rFonts w:ascii="Calibri" w:cs="Calibri" w:eastAsia="Calibri" w:hAnsi="Calibri"/>
+          <w:sz w:val="21"/>
+          <w:szCs w:val="21"/>
+        </w:rPr>
+        <w:t xml:space="preserve">Coût à terminaison : mettez à jour l'estimation à chaque revue ; un dépassement de 10 % ou plus est critique.</w:t>
+      </w:r>
+    </w:p>
+    <w:p>
+      <w:pPr>
+        <w:pStyle w:val="Heading2"/>
+        <w:keepNext/>
+      </w:pPr>
+      <w:r>
+        <w:t xml:space="preserve">Trajectoire du score</w:t>
+      </w:r>
+    </w:p>
+    <w:p>
+      <w:pPr>
+        <w:spacing w:after="120" w:before="0" w:line="276"/>
+      </w:pPr>
+      <w:r>
+        <w:rPr>
+          <w:rFonts w:ascii="Calibri" w:cs="Calibri" w:eastAsia="Calibri" w:hAnsi="Calibri"/>
+          <w:sz w:val="21"/>
+          <w:szCs w:val="21"/>
+        </w:rPr>
+        <w:t xml:space="preserve">Le score est recalculé à chaque revue. La carte « Évolution du score » signale une alerte précoce dès que le score perd 5 points ou plus sur les 3 derniers calculs, ou que la décision se dégrade ; une vigilance en cas de baisses consécutives ou d'approche d'un seuil. Un écart dû à un changement de version du modèle (v4 → v5) est signalé comme tel et n'est pas lu comme une dégradation.</w:t>
+      </w:r>
+    </w:p>
+    <w:p>
+      <w:pPr>
+        <w:pStyle w:val="Heading2"/>
+        <w:keepNext/>
+      </w:pPr>
+      <w:r>
         <w:t xml:space="preserve">Mainlevées partielles</w:t>
       </w:r>
     </w:p>
@@ -21053,7 +23833,7 @@
           <w:sz w:val="21"/>
           <w:szCs w:val="21"/>
         </w:rPr>
-        <w:t xml:space="preserve">Le classeur PI_Promotion_Modele_v4.xlsx reproduit exactement le calcul de l'application (vérifié sur 20 cas de référence). Il sert à simuler, préparer un comité, travailler hors connexion ou se former. La décision officielle et la traçabilité restent dans l'application.</w:t>
+        <w:t xml:space="preserve">Le classeur PI_Promotion_Modele_v5.xlsx reproduit exactement le calcul de l'application (vérifié sur 26 cas de référence). Il sert à simuler, préparer un comité, travailler hors connexion ou se former. La décision officielle et la traçabilité restent dans l'application.</w:t>
       </w:r>
     </w:p>
     <w:p>
@@ -21134,7 +23914,7 @@
           <w:sz w:val="21"/>
           <w:szCs w:val="21"/>
         </w:rPr>
-        <w:t xml:space="preserve">Onglet Calculateurs : chaîne d'autorisations, ventes sécurisées, quotité de désengagement, division des risques, durée d'arrêt de chantier.</w:t>
+        <w:t xml:space="preserve">Onglet Calculateurs : chaîne d'autorisations, ventes sécurisées, quotité de désengagement, division des risques, durée d'arrêt de chantier, et (v5) déblocages vs avancement et plan de tirage, équipements exigés, programme mixte, désistements, coût à terminaison.</w:t>
       </w:r>
     </w:p>
     <w:p>
@@ -24473,6 +27253,534 @@
           </w:p>
         </w:tc>
       </w:tr>
+      <w:tr>
+        <w:trPr>
+          <w:cantSplit/>
+        </w:trPr>
+        <w:tc>
+          <w:tcPr>
+            <w:tcW w:type="dxa" w:w="500"/>
+            <w:tcMar>
+              <w:top w:type="dxa" w:w="40"/>
+              <w:left w:type="dxa" w:w="80"/>
+              <w:bottom w:type="dxa" w:w="40"/>
+              <w:right w:type="dxa" w:w="80"/>
+            </w:tcMar>
+          </w:tcPr>
+          <w:p>
+            <w:pPr>
+              <w:spacing w:after="0" w:line="240"/>
+              <w:jc w:val="center"/>
+            </w:pPr>
+            <w:r>
+              <w:rPr>
+                <w:rFonts w:ascii="Calibri" w:cs="Calibri" w:eastAsia="Calibri" w:hAnsi="Calibri"/>
+                <w:sz w:val="22"/>
+                <w:szCs w:val="22"/>
+              </w:rPr>
+              <w:t xml:space="preserve">☐</w:t>
+            </w:r>
+          </w:p>
+        </w:tc>
+        <w:tc>
+          <w:tcPr>
+            <w:tcW w:type="dxa" w:w="700"/>
+            <w:tcMar>
+              <w:top w:type="dxa" w:w="40"/>
+              <w:left w:type="dxa" w:w="80"/>
+              <w:bottom w:type="dxa" w:w="40"/>
+              <w:right w:type="dxa" w:w="80"/>
+            </w:tcMar>
+          </w:tcPr>
+          <w:p>
+            <w:pPr>
+              <w:spacing w:after="0" w:line="240"/>
+            </w:pPr>
+            <w:r>
+              <w:rPr>
+                <w:rFonts w:ascii="Calibri" w:cs="Calibri" w:eastAsia="Calibri" w:hAnsi="Calibri"/>
+                <w:b/>
+                <w:bCs/>
+                <w:sz w:val="17"/>
+                <w:szCs w:val="17"/>
+              </w:rPr>
+              <w:t xml:space="preserve">P34</w:t>
+            </w:r>
+          </w:p>
+        </w:tc>
+        <w:tc>
+          <w:tcPr>
+            <w:tcW w:type="dxa" w:w="6438"/>
+            <w:tcMar>
+              <w:top w:type="dxa" w:w="40"/>
+              <w:left w:type="dxa" w:w="80"/>
+              <w:bottom w:type="dxa" w:w="40"/>
+              <w:right w:type="dxa" w:w="80"/>
+            </w:tcMar>
+          </w:tcPr>
+          <w:p>
+            <w:pPr>
+              <w:spacing w:after="0" w:line="240"/>
+            </w:pPr>
+            <w:r>
+              <w:rPr>
+                <w:rFonts w:ascii="Calibri" w:cs="Calibri" w:eastAsia="Calibri" w:hAnsi="Calibri"/>
+                <w:sz w:val="17"/>
+                <w:szCs w:val="17"/>
+              </w:rPr>
+              <w:t xml:space="preserve">Plan de masse et découpage en tranches : tranches financées par la banque, ouvrages communs (accès, VRD, raccordements) et leur financement</w:t>
+            </w:r>
+          </w:p>
+        </w:tc>
+        <w:tc>
+          <w:tcPr>
+            <w:tcW w:type="dxa" w:w="2000"/>
+            <w:tcMar>
+              <w:top w:type="dxa" w:w="40"/>
+              <w:left w:type="dxa" w:w="80"/>
+              <w:bottom w:type="dxa" w:w="40"/>
+              <w:right w:type="dxa" w:w="80"/>
+            </w:tcMar>
+          </w:tcPr>
+          <w:p>
+            <w:pPr>
+              <w:spacing w:after="0" w:line="240"/>
+            </w:pPr>
+            <w:r>
+              <w:rPr>
+                <w:rFonts w:ascii="Calibri" w:cs="Calibri" w:eastAsia="Calibri" w:hAnsi="Calibri"/>
+                <w:sz w:val="17"/>
+                <w:szCs w:val="17"/>
+              </w:rPr>
+              <w:t xml:space="preserve"/>
+            </w:r>
+          </w:p>
+        </w:tc>
+      </w:tr>
+      <w:tr>
+        <w:trPr>
+          <w:cantSplit/>
+        </w:trPr>
+        <w:tc>
+          <w:tcPr>
+            <w:tcW w:type="dxa" w:w="500"/>
+            <w:shd w:fill="F2F5FB" w:color="auto" w:val="clear"/>
+            <w:tcMar>
+              <w:top w:type="dxa" w:w="40"/>
+              <w:left w:type="dxa" w:w="80"/>
+              <w:bottom w:type="dxa" w:w="40"/>
+              <w:right w:type="dxa" w:w="80"/>
+            </w:tcMar>
+          </w:tcPr>
+          <w:p>
+            <w:pPr>
+              <w:spacing w:after="0" w:line="240"/>
+              <w:jc w:val="center"/>
+            </w:pPr>
+            <w:r>
+              <w:rPr>
+                <w:rFonts w:ascii="Calibri" w:cs="Calibri" w:eastAsia="Calibri" w:hAnsi="Calibri"/>
+                <w:sz w:val="22"/>
+                <w:szCs w:val="22"/>
+              </w:rPr>
+              <w:t xml:space="preserve">☐</w:t>
+            </w:r>
+          </w:p>
+        </w:tc>
+        <w:tc>
+          <w:tcPr>
+            <w:tcW w:type="dxa" w:w="700"/>
+            <w:shd w:fill="F2F5FB" w:color="auto" w:val="clear"/>
+            <w:tcMar>
+              <w:top w:type="dxa" w:w="40"/>
+              <w:left w:type="dxa" w:w="80"/>
+              <w:bottom w:type="dxa" w:w="40"/>
+              <w:right w:type="dxa" w:w="80"/>
+            </w:tcMar>
+          </w:tcPr>
+          <w:p>
+            <w:pPr>
+              <w:spacing w:after="0" w:line="240"/>
+            </w:pPr>
+            <w:r>
+              <w:rPr>
+                <w:rFonts w:ascii="Calibri" w:cs="Calibri" w:eastAsia="Calibri" w:hAnsi="Calibri"/>
+                <w:b/>
+                <w:bCs/>
+                <w:sz w:val="17"/>
+                <w:szCs w:val="17"/>
+              </w:rPr>
+              <w:t xml:space="preserve">P35</w:t>
+            </w:r>
+          </w:p>
+        </w:tc>
+        <w:tc>
+          <w:tcPr>
+            <w:tcW w:type="dxa" w:w="6438"/>
+            <w:shd w:fill="F2F5FB" w:color="auto" w:val="clear"/>
+            <w:tcMar>
+              <w:top w:type="dxa" w:w="40"/>
+              <w:left w:type="dxa" w:w="80"/>
+              <w:bottom w:type="dxa" w:w="40"/>
+              <w:right w:type="dxa" w:w="80"/>
+            </w:tcMar>
+          </w:tcPr>
+          <w:p>
+            <w:pPr>
+              <w:spacing w:after="0" w:line="240"/>
+            </w:pPr>
+            <w:r>
+              <w:rPr>
+                <w:rFonts w:ascii="Calibri" w:cs="Calibri" w:eastAsia="Calibri" w:hAnsi="Calibri"/>
+                <w:sz w:val="17"/>
+                <w:szCs w:val="17"/>
+              </w:rPr>
+              <w:t xml:space="preserve">Cahier des charges du lotissement, convention avec la commune ou prescriptions de l'autorisation fixant les équipements exigés (mosquée, école, voirie…), avec coût, calendrier et financeur</w:t>
+            </w:r>
+          </w:p>
+        </w:tc>
+        <w:tc>
+          <w:tcPr>
+            <w:tcW w:type="dxa" w:w="2000"/>
+            <w:shd w:fill="F2F5FB" w:color="auto" w:val="clear"/>
+            <w:tcMar>
+              <w:top w:type="dxa" w:w="40"/>
+              <w:left w:type="dxa" w:w="80"/>
+              <w:bottom w:type="dxa" w:w="40"/>
+              <w:right w:type="dxa" w:w="80"/>
+            </w:tcMar>
+          </w:tcPr>
+          <w:p>
+            <w:pPr>
+              <w:spacing w:after="0" w:line="240"/>
+            </w:pPr>
+            <w:r>
+              <w:rPr>
+                <w:rFonts w:ascii="Calibri" w:cs="Calibri" w:eastAsia="Calibri" w:hAnsi="Calibri"/>
+                <w:sz w:val="17"/>
+                <w:szCs w:val="17"/>
+              </w:rPr>
+              <w:t xml:space="preserve"/>
+            </w:r>
+          </w:p>
+        </w:tc>
+      </w:tr>
+      <w:tr>
+        <w:trPr>
+          <w:cantSplit/>
+        </w:trPr>
+        <w:tc>
+          <w:tcPr>
+            <w:tcW w:type="dxa" w:w="500"/>
+            <w:tcMar>
+              <w:top w:type="dxa" w:w="40"/>
+              <w:left w:type="dxa" w:w="80"/>
+              <w:bottom w:type="dxa" w:w="40"/>
+              <w:right w:type="dxa" w:w="80"/>
+            </w:tcMar>
+          </w:tcPr>
+          <w:p>
+            <w:pPr>
+              <w:spacing w:after="0" w:line="240"/>
+              <w:jc w:val="center"/>
+            </w:pPr>
+            <w:r>
+              <w:rPr>
+                <w:rFonts w:ascii="Calibri" w:cs="Calibri" w:eastAsia="Calibri" w:hAnsi="Calibri"/>
+                <w:sz w:val="22"/>
+                <w:szCs w:val="22"/>
+              </w:rPr>
+              <w:t xml:space="preserve">☐</w:t>
+            </w:r>
+          </w:p>
+        </w:tc>
+        <w:tc>
+          <w:tcPr>
+            <w:tcW w:type="dxa" w:w="700"/>
+            <w:tcMar>
+              <w:top w:type="dxa" w:w="40"/>
+              <w:left w:type="dxa" w:w="80"/>
+              <w:bottom w:type="dxa" w:w="40"/>
+              <w:right w:type="dxa" w:w="80"/>
+            </w:tcMar>
+          </w:tcPr>
+          <w:p>
+            <w:pPr>
+              <w:spacing w:after="0" w:line="240"/>
+            </w:pPr>
+            <w:r>
+              <w:rPr>
+                <w:rFonts w:ascii="Calibri" w:cs="Calibri" w:eastAsia="Calibri" w:hAnsi="Calibri"/>
+                <w:b/>
+                <w:bCs/>
+                <w:sz w:val="17"/>
+                <w:szCs w:val="17"/>
+              </w:rPr>
+              <w:t xml:space="preserve">P36</w:t>
+            </w:r>
+          </w:p>
+        </w:tc>
+        <w:tc>
+          <w:tcPr>
+            <w:tcW w:type="dxa" w:w="6438"/>
+            <w:tcMar>
+              <w:top w:type="dxa" w:w="40"/>
+              <w:left w:type="dxa" w:w="80"/>
+              <w:bottom w:type="dxa" w:w="40"/>
+              <w:right w:type="dxa" w:w="80"/>
+            </w:tcMar>
+          </w:tcPr>
+          <w:p>
+            <w:pPr>
+              <w:spacing w:after="0" w:line="240"/>
+            </w:pPr>
+            <w:r>
+              <w:rPr>
+                <w:rFonts w:ascii="Calibri" w:cs="Calibri" w:eastAsia="Calibri" w:hAnsi="Calibri"/>
+                <w:sz w:val="17"/>
+                <w:szCs w:val="17"/>
+              </w:rPr>
+              <w:t xml:space="preserve">Marché de travaux de l'entreprise générale : classification / qualification, nature (forfait, régie), caution de bonne exécution, retenue de garantie</w:t>
+            </w:r>
+          </w:p>
+        </w:tc>
+        <w:tc>
+          <w:tcPr>
+            <w:tcW w:type="dxa" w:w="2000"/>
+            <w:tcMar>
+              <w:top w:type="dxa" w:w="40"/>
+              <w:left w:type="dxa" w:w="80"/>
+              <w:bottom w:type="dxa" w:w="40"/>
+              <w:right w:type="dxa" w:w="80"/>
+            </w:tcMar>
+          </w:tcPr>
+          <w:p>
+            <w:pPr>
+              <w:spacing w:after="0" w:line="240"/>
+            </w:pPr>
+            <w:r>
+              <w:rPr>
+                <w:rFonts w:ascii="Calibri" w:cs="Calibri" w:eastAsia="Calibri" w:hAnsi="Calibri"/>
+                <w:sz w:val="17"/>
+                <w:szCs w:val="17"/>
+              </w:rPr>
+              <w:t xml:space="preserve"/>
+            </w:r>
+          </w:p>
+        </w:tc>
+      </w:tr>
+      <w:tr>
+        <w:trPr>
+          <w:cantSplit/>
+        </w:trPr>
+        <w:tc>
+          <w:tcPr>
+            <w:tcW w:type="dxa" w:w="500"/>
+            <w:shd w:fill="F2F5FB" w:color="auto" w:val="clear"/>
+            <w:tcMar>
+              <w:top w:type="dxa" w:w="40"/>
+              <w:left w:type="dxa" w:w="80"/>
+              <w:bottom w:type="dxa" w:w="40"/>
+              <w:right w:type="dxa" w:w="80"/>
+            </w:tcMar>
+          </w:tcPr>
+          <w:p>
+            <w:pPr>
+              <w:spacing w:after="0" w:line="240"/>
+              <w:jc w:val="center"/>
+            </w:pPr>
+            <w:r>
+              <w:rPr>
+                <w:rFonts w:ascii="Calibri" w:cs="Calibri" w:eastAsia="Calibri" w:hAnsi="Calibri"/>
+                <w:sz w:val="22"/>
+                <w:szCs w:val="22"/>
+              </w:rPr>
+              <w:t xml:space="preserve">☐</w:t>
+            </w:r>
+          </w:p>
+        </w:tc>
+        <w:tc>
+          <w:tcPr>
+            <w:tcW w:type="dxa" w:w="700"/>
+            <w:shd w:fill="F2F5FB" w:color="auto" w:val="clear"/>
+            <w:tcMar>
+              <w:top w:type="dxa" w:w="40"/>
+              <w:left w:type="dxa" w:w="80"/>
+              <w:bottom w:type="dxa" w:w="40"/>
+              <w:right w:type="dxa" w:w="80"/>
+            </w:tcMar>
+          </w:tcPr>
+          <w:p>
+            <w:pPr>
+              <w:spacing w:after="0" w:line="240"/>
+            </w:pPr>
+            <w:r>
+              <w:rPr>
+                <w:rFonts w:ascii="Calibri" w:cs="Calibri" w:eastAsia="Calibri" w:hAnsi="Calibri"/>
+                <w:b/>
+                <w:bCs/>
+                <w:sz w:val="17"/>
+                <w:szCs w:val="17"/>
+              </w:rPr>
+              <w:t xml:space="preserve">P37</w:t>
+            </w:r>
+          </w:p>
+        </w:tc>
+        <w:tc>
+          <w:tcPr>
+            <w:tcW w:type="dxa" w:w="6438"/>
+            <w:shd w:fill="F2F5FB" w:color="auto" w:val="clear"/>
+            <w:tcMar>
+              <w:top w:type="dxa" w:w="40"/>
+              <w:left w:type="dxa" w:w="80"/>
+              <w:bottom w:type="dxa" w:w="40"/>
+              <w:right w:type="dxa" w:w="80"/>
+            </w:tcMar>
+          </w:tcPr>
+          <w:p>
+            <w:pPr>
+              <w:spacing w:after="0" w:line="240"/>
+            </w:pPr>
+            <w:r>
+              <w:rPr>
+                <w:rFonts w:ascii="Calibri" w:cs="Calibri" w:eastAsia="Calibri" w:hAnsi="Calibri"/>
+                <w:sz w:val="17"/>
+                <w:szCs w:val="17"/>
+              </w:rPr>
+              <w:t xml:space="preserve">Coût à terminaison actualisé (budget initial, engagé, reste à engager, écarts)</w:t>
+            </w:r>
+          </w:p>
+        </w:tc>
+        <w:tc>
+          <w:tcPr>
+            <w:tcW w:type="dxa" w:w="2000"/>
+            <w:shd w:fill="F2F5FB" w:color="auto" w:val="clear"/>
+            <w:tcMar>
+              <w:top w:type="dxa" w:w="40"/>
+              <w:left w:type="dxa" w:w="80"/>
+              <w:bottom w:type="dxa" w:w="40"/>
+              <w:right w:type="dxa" w:w="80"/>
+            </w:tcMar>
+          </w:tcPr>
+          <w:p>
+            <w:pPr>
+              <w:spacing w:after="0" w:line="240"/>
+            </w:pPr>
+            <w:r>
+              <w:rPr>
+                <w:rFonts w:ascii="Calibri" w:cs="Calibri" w:eastAsia="Calibri" w:hAnsi="Calibri"/>
+                <w:sz w:val="17"/>
+                <w:szCs w:val="17"/>
+              </w:rPr>
+              <w:t xml:space="preserve"/>
+            </w:r>
+          </w:p>
+        </w:tc>
+      </w:tr>
+      <w:tr>
+        <w:trPr>
+          <w:cantSplit/>
+        </w:trPr>
+        <w:tc>
+          <w:tcPr>
+            <w:tcW w:type="dxa" w:w="500"/>
+            <w:tcMar>
+              <w:top w:type="dxa" w:w="40"/>
+              <w:left w:type="dxa" w:w="80"/>
+              <w:bottom w:type="dxa" w:w="40"/>
+              <w:right w:type="dxa" w:w="80"/>
+            </w:tcMar>
+          </w:tcPr>
+          <w:p>
+            <w:pPr>
+              <w:spacing w:after="0" w:line="240"/>
+              <w:jc w:val="center"/>
+            </w:pPr>
+            <w:r>
+              <w:rPr>
+                <w:rFonts w:ascii="Calibri" w:cs="Calibri" w:eastAsia="Calibri" w:hAnsi="Calibri"/>
+                <w:sz w:val="22"/>
+                <w:szCs w:val="22"/>
+              </w:rPr>
+              <w:t xml:space="preserve">☐</w:t>
+            </w:r>
+          </w:p>
+        </w:tc>
+        <w:tc>
+          <w:tcPr>
+            <w:tcW w:type="dxa" w:w="700"/>
+            <w:tcMar>
+              <w:top w:type="dxa" w:w="40"/>
+              <w:left w:type="dxa" w:w="80"/>
+              <w:bottom w:type="dxa" w:w="40"/>
+              <w:right w:type="dxa" w:w="80"/>
+            </w:tcMar>
+          </w:tcPr>
+          <w:p>
+            <w:pPr>
+              <w:spacing w:after="0" w:line="240"/>
+            </w:pPr>
+            <w:r>
+              <w:rPr>
+                <w:rFonts w:ascii="Calibri" w:cs="Calibri" w:eastAsia="Calibri" w:hAnsi="Calibri"/>
+                <w:b/>
+                <w:bCs/>
+                <w:sz w:val="17"/>
+                <w:szCs w:val="17"/>
+              </w:rPr>
+              <w:t xml:space="preserve">P39</w:t>
+            </w:r>
+          </w:p>
+        </w:tc>
+        <w:tc>
+          <w:tcPr>
+            <w:tcW w:type="dxa" w:w="6438"/>
+            <w:tcMar>
+              <w:top w:type="dxa" w:w="40"/>
+              <w:left w:type="dxa" w:w="80"/>
+              <w:bottom w:type="dxa" w:w="40"/>
+              <w:right w:type="dxa" w:w="80"/>
+            </w:tcMar>
+          </w:tcPr>
+          <w:p>
+            <w:pPr>
+              <w:spacing w:after="0" w:line="240"/>
+            </w:pPr>
+            <w:r>
+              <w:rPr>
+                <w:rFonts w:ascii="Calibri" w:cs="Calibri" w:eastAsia="Calibri" w:hAnsi="Calibri"/>
+                <w:sz w:val="17"/>
+                <w:szCs w:val="17"/>
+              </w:rPr>
+              <w:t xml:space="preserve">Note de conjoncture du marché régional (référentiel « Marché régional » de la Direction des risques) ou étude de marché régionale</w:t>
+            </w:r>
+          </w:p>
+        </w:tc>
+        <w:tc>
+          <w:tcPr>
+            <w:tcW w:type="dxa" w:w="2000"/>
+            <w:tcMar>
+              <w:top w:type="dxa" w:w="40"/>
+              <w:left w:type="dxa" w:w="80"/>
+              <w:bottom w:type="dxa" w:w="40"/>
+              <w:right w:type="dxa" w:w="80"/>
+            </w:tcMar>
+          </w:tcPr>
+          <w:p>
+            <w:pPr>
+              <w:spacing w:after="0" w:line="240"/>
+            </w:pPr>
+            <w:r>
+              <w:rPr>
+                <w:rFonts w:ascii="Calibri" w:cs="Calibri" w:eastAsia="Calibri" w:hAnsi="Calibri"/>
+                <w:sz w:val="17"/>
+                <w:szCs w:val="17"/>
+              </w:rPr>
+              <w:t xml:space="preserve"/>
+            </w:r>
+          </w:p>
+        </w:tc>
+      </w:tr>
     </w:tbl>
     <w:p>
       <w:pPr>
@@ -25021,6 +28329,110 @@
           <w:tcPr>
             <w:tcW w:type="dxa" w:w="2000"/>
             <w:shd w:fill="F2F5FB" w:color="auto" w:val="clear"/>
+            <w:tcMar>
+              <w:top w:type="dxa" w:w="40"/>
+              <w:left w:type="dxa" w:w="80"/>
+              <w:bottom w:type="dxa" w:w="40"/>
+              <w:right w:type="dxa" w:w="80"/>
+            </w:tcMar>
+          </w:tcPr>
+          <w:p>
+            <w:pPr>
+              <w:spacing w:after="0" w:line="240"/>
+            </w:pPr>
+            <w:r>
+              <w:rPr>
+                <w:rFonts w:ascii="Calibri" w:cs="Calibri" w:eastAsia="Calibri" w:hAnsi="Calibri"/>
+                <w:sz w:val="17"/>
+                <w:szCs w:val="17"/>
+              </w:rPr>
+              <w:t xml:space="preserve"/>
+            </w:r>
+          </w:p>
+        </w:tc>
+      </w:tr>
+      <w:tr>
+        <w:trPr>
+          <w:cantSplit/>
+        </w:trPr>
+        <w:tc>
+          <w:tcPr>
+            <w:tcW w:type="dxa" w:w="500"/>
+            <w:tcMar>
+              <w:top w:type="dxa" w:w="40"/>
+              <w:left w:type="dxa" w:w="80"/>
+              <w:bottom w:type="dxa" w:w="40"/>
+              <w:right w:type="dxa" w:w="80"/>
+            </w:tcMar>
+          </w:tcPr>
+          <w:p>
+            <w:pPr>
+              <w:spacing w:after="0" w:line="240"/>
+              <w:jc w:val="center"/>
+            </w:pPr>
+            <w:r>
+              <w:rPr>
+                <w:rFonts w:ascii="Calibri" w:cs="Calibri" w:eastAsia="Calibri" w:hAnsi="Calibri"/>
+                <w:sz w:val="22"/>
+                <w:szCs w:val="22"/>
+              </w:rPr>
+              <w:t xml:space="preserve">☐</w:t>
+            </w:r>
+          </w:p>
+        </w:tc>
+        <w:tc>
+          <w:tcPr>
+            <w:tcW w:type="dxa" w:w="700"/>
+            <w:tcMar>
+              <w:top w:type="dxa" w:w="40"/>
+              <w:left w:type="dxa" w:w="80"/>
+              <w:bottom w:type="dxa" w:w="40"/>
+              <w:right w:type="dxa" w:w="80"/>
+            </w:tcMar>
+          </w:tcPr>
+          <w:p>
+            <w:pPr>
+              <w:spacing w:after="0" w:line="240"/>
+            </w:pPr>
+            <w:r>
+              <w:rPr>
+                <w:rFonts w:ascii="Calibri" w:cs="Calibri" w:eastAsia="Calibri" w:hAnsi="Calibri"/>
+                <w:b/>
+                <w:bCs/>
+                <w:sz w:val="17"/>
+                <w:szCs w:val="17"/>
+              </w:rPr>
+              <w:t xml:space="preserve">P38</w:t>
+            </w:r>
+          </w:p>
+        </w:tc>
+        <w:tc>
+          <w:tcPr>
+            <w:tcW w:type="dxa" w:w="6438"/>
+            <w:tcMar>
+              <w:top w:type="dxa" w:w="40"/>
+              <w:left w:type="dxa" w:w="80"/>
+              <w:bottom w:type="dxa" w:w="40"/>
+              <w:right w:type="dxa" w:w="80"/>
+            </w:tcMar>
+          </w:tcPr>
+          <w:p>
+            <w:pPr>
+              <w:spacing w:after="0" w:line="240"/>
+            </w:pPr>
+            <w:r>
+              <w:rPr>
+                <w:rFonts w:ascii="Calibri" w:cs="Calibri" w:eastAsia="Calibri" w:hAnsi="Calibri"/>
+                <w:sz w:val="17"/>
+                <w:szCs w:val="17"/>
+              </w:rPr>
+              <w:t xml:space="preserve">Lettre d'engagement d'un opérateur hôtelier, d'un investisseur ou de preneurs pour les composantes non résidentielles (hôtel, commerces, bureaux)</w:t>
+            </w:r>
+          </w:p>
+        </w:tc>
+        <w:tc>
+          <w:tcPr>
+            <w:tcW w:type="dxa" w:w="2000"/>
             <w:tcMar>
               <w:top w:type="dxa" w:w="40"/>
               <w:left w:type="dxa" w:w="80"/>
@@ -27074,7 +30486,7 @@
         <w:sz w:val="15"/>
         <w:szCs w:val="15"/>
       </w:rPr>
-      <w:t xml:space="preserve">Guide du chargé d'affaires — promotion immobilière · modèle v4.0.0</w:t>
+      <w:t xml:space="preserve">Guide du chargé d'affaires — promotion immobilière · modèle v5.0.0</w:t>
     </w:r>
   </w:p>
 </w:hdr>
@@ -27097,7 +30509,7 @@
         <w:sz w:val="15"/>
         <w:szCs w:val="15"/>
       </w:rPr>
-      <w:t xml:space="preserve">Guide du chargé d'affaires — promotion immobilière · modèle v4.0.0</w:t>
+      <w:t xml:space="preserve">Guide du chargé d'affaires — promotion immobilière · modèle v5.0.0</w:t>
     </w:r>
   </w:p>
 </w:hdr>
@@ -27120,7 +30532,7 @@
         <w:sz w:val="15"/>
         <w:szCs w:val="15"/>
       </w:rPr>
-      <w:t xml:space="preserve">Guide du chargé d'affaires — promotion immobilière · modèle v4.0.0</w:t>
+      <w:t xml:space="preserve">Guide du chargé d'affaires — promotion immobilière · modèle v5.0.0</w:t>
     </w:r>
   </w:p>
 </w:hdr>

</xml_diff>